<commit_message>
Add HeatGuard Atlas React UI built with React Bits
Vite + React + Tailwind single-page app (Aurora hero, Stepper wizard,
DecryptedText alert, SpotlightCard, AnimatedList trace/advisory, Magnet,
StarBorder, ClickSpark) backed by a stdlib JSON API (server.py) over the
same inference engine. Built UI is committed so it runs without Node.
</commit_message>
<xml_diff>
--- a/docs/HeatGuard_Report.docx
+++ b/docs/HeatGuard_Report.docx
@@ -12660,6 +12660,24 @@
         <w:rPr>
           <w:rStyle w:val="VerbatimChar"/>
         </w:rPr>
+        <w:t xml:space="preserve">server.py            JSON API + host for the React UI (stdlib only)</w:t>
+      </w:r>
+      <w:r>
+        <w:br/>
+      </w:r>
+      <w:r>
+        <w:rPr>
+          <w:rStyle w:val="VerbatimChar"/>
+        </w:rPr>
+        <w:t xml:space="preserve">frontend/            HeatGuard Atlas React UI (Vite, Tailwind, React Bits)</w:t>
+      </w:r>
+      <w:r>
+        <w:br/>
+      </w:r>
+      <w:r>
+        <w:rPr>
+          <w:rStyle w:val="VerbatimChar"/>
+        </w:rPr>
         <w:t xml:space="preserve">app.py               Streamlit web interface (optional)</w:t>
       </w:r>
       <w:r>
@@ -13404,7 +13422,7 @@
           <w:bCs/>
           <w:b/>
         </w:rPr>
-        <w:t xml:space="preserve">Web UI</w:t>
+        <w:t xml:space="preserve">HeatGuard Atlas web UI</w:t>
       </w:r>
       <w:r>
         <w:t xml:space="preserve"> </w:t>
@@ -13416,10 +13434,52 @@
         <w:rPr>
           <w:rStyle w:val="VerbatimChar"/>
         </w:rPr>
-        <w:t xml:space="preserve">streamlit run app.py</w:t>
-      </w:r>
-      <w:r>
-        <w:t xml:space="preserve">): sidebar form, colour-coded alert banner, advisory, trace, HOW selector, and browsable knowledge base.</w:t>
+        <w:t xml:space="preserve">python server.py</w:t>
+      </w:r>
+      <w:r>
+        <w:t xml:space="preserve">, then open http://localhost:8000): a React + Tailwind single-page app built with React Bits components. It has an Aurora hero, a four-step Stepper consultation, the live verdict with a decrypting alert level, SpotlightCards, AnimatedList advisories and rule-firing trace, an interactive HOW proof tree, and a searchable knowledge base that highlights the rules that fired. The Python standard-library server (</w:t>
+      </w:r>
+      <w:r>
+        <w:rPr>
+          <w:rStyle w:val="VerbatimChar"/>
+        </w:rPr>
+        <w:t xml:space="preserve">server.py</w:t>
+      </w:r>
+      <w:r>
+        <w:t xml:space="preserve">) exposes the engine as a JSON API (</w:t>
+      </w:r>
+      <w:r>
+        <w:rPr>
+          <w:rStyle w:val="VerbatimChar"/>
+        </w:rPr>
+        <w:t xml:space="preserve">/api/consult</w:t>
+      </w:r>
+      <w:r>
+        <w:t xml:space="preserve">,</w:t>
+      </w:r>
+      <w:r>
+        <w:t xml:space="preserve"> </w:t>
+      </w:r>
+      <w:r>
+        <w:rPr>
+          <w:rStyle w:val="VerbatimChar"/>
+        </w:rPr>
+        <w:t xml:space="preserve">/api/kb</w:t>
+      </w:r>
+      <w:r>
+        <w:t xml:space="preserve">,</w:t>
+      </w:r>
+      <w:r>
+        <w:t xml:space="preserve"> </w:t>
+      </w:r>
+      <w:r>
+        <w:rPr>
+          <w:rStyle w:val="VerbatimChar"/>
+        </w:rPr>
+        <w:t xml:space="preserve">/api/scenarios</w:t>
+      </w:r>
+      <w:r>
+        <w:t xml:space="preserve">), so the UI and the CLI share exactly the same inference engine.</w:t>
       </w:r>
     </w:p>
     <w:p>
@@ -13435,6 +13495,37 @@
           <w:bCs/>
           <w:b/>
         </w:rPr>
+        <w:t xml:space="preserve">Streamlit UI</w:t>
+      </w:r>
+      <w:r>
+        <w:t xml:space="preserve"> </w:t>
+      </w:r>
+      <w:r>
+        <w:t xml:space="preserve">(</w:t>
+      </w:r>
+      <w:r>
+        <w:rPr>
+          <w:rStyle w:val="VerbatimChar"/>
+        </w:rPr>
+        <w:t xml:space="preserve">streamlit run app.py</w:t>
+      </w:r>
+      <w:r>
+        <w:t xml:space="preserve">): a lighter alternative interface.</w:t>
+      </w:r>
+    </w:p>
+    <w:p>
+      <w:pPr>
+        <w:numPr>
+          <w:ilvl w:val="0"/>
+          <w:numId w:val="1009"/>
+        </w:numPr>
+        <w:pStyle w:val="Compact"/>
+      </w:pPr>
+      <w:r>
+        <w:rPr>
+          <w:bCs/>
+          <w:b/>
+        </w:rPr>
         <w:t xml:space="preserve">Prolog</w:t>
       </w:r>
       <w:r>
@@ -14121,7 +14212,7 @@
         <w:t xml:space="preserve"> </w:t>
       </w:r>
       <w:r>
-        <w:t xml:space="preserve">plus unit tests for conflict resolution, the HOW explanation, the heat-index reference values and wrong-type input. Each scenario asserts the expected conclusions, the rules that must fire and the rules that must</w:t>
+        <w:t xml:space="preserve">plus unit tests for the web API, conflict resolution, the HOW explanation, the heat-index reference values and wrong-type input. Each scenario asserts the expected conclusions, the rules that must fire and the rules that must</w:t>
       </w:r>
       <w:r>
         <w:t xml:space="preserve"> </w:t>
@@ -14149,7 +14240,7 @@
           <w:bCs/>
           <w:b/>
         </w:rPr>
-        <w:t xml:space="preserve">Result: 22 passed in 0.04s</w:t>
+        <w:t xml:space="preserve">Result: 25 passed in 0.06s</w:t>
       </w:r>
     </w:p>
     <w:bookmarkStart w:id="42" w:name="summary"/>

</xml_diff>

<commit_message>
Reach 100% rule coverage, add KB consistency checker and study guide
- 8 new scenarios (TC16-TC23) so every one of the 59 rules fires in a test
- heatwave_es.kb_check: dead-rule, source, redundancy and contradiction
  checks plus rule coverage, wired into pytest (35 tests)
- docs/STUDY_GUIDE.md: rubric map, domain, theory, code walkthrough,
  cycle-by-cycle trace, demo script, live-modification drills, 105 Q&As
- report regenerated with the verification section
</commit_message>
<xml_diff>
--- a/docs/HeatGuard_Report.docx
+++ b/docs/HeatGuard_Report.docx
@@ -1455,7 +1455,7 @@
     </w:p>
     <w:bookmarkEnd w:id="24"/>
     <w:bookmarkEnd w:id="25"/>
-    <w:bookmarkStart w:id="34" w:name="d2.-knowledge-base-design"/>
+    <w:bookmarkStart w:id="35" w:name="d2.-knowledge-base-design"/>
     <w:p>
       <w:pPr>
         <w:pStyle w:val="Heading1"/>
@@ -5600,7 +5600,7 @@
               <w:rPr>
                 <w:sz w:val="16"/>
               </w:rPr>
-              <w:t xml:space="preserve">AND tmax &gt;= 37</w:t>
+              <w:t xml:space="preserve">AND tmax &gt;= 35</w:t>
             </w:r>
           </w:p>
         </w:tc>
@@ -12570,8 +12570,302 @@
       </w:r>
     </w:p>
     <w:bookmarkEnd w:id="33"/>
+    <w:bookmarkStart w:id="34" w:name="automated-consistency-verification"/>
+    <w:p>
+      <w:pPr>
+        <w:pStyle w:val="Heading2"/>
+      </w:pPr>
+      <w:r>
+        <w:t xml:space="preserve">2.6 Automated consistency verification</w:t>
+      </w:r>
+    </w:p>
+    <w:p>
+      <w:pPr>
+        <w:pStyle w:val="FirstParagraph"/>
+      </w:pPr>
+      <w:r>
+        <w:rPr>
+          <w:rStyle w:val="VerbatimChar"/>
+        </w:rPr>
+        <w:t xml:space="preserve">python -m heatwave_es.kb_check</w:t>
+      </w:r>
+      <w:r>
+        <w:t xml:space="preserve"> </w:t>
+      </w:r>
+      <w:r>
+        <w:t xml:space="preserve">analyses the knowledge base statically and runs it against every test scenario:</w:t>
+      </w:r>
+    </w:p>
+    <w:tbl>
+      <w:tblPr>
+        <w:tblStyle w:val="Table"/>
+        <w:tblW w:type="pct" w:w="5000"/>
+        <w:tblLook w:firstRow="1" w:lastRow="0" w:firstColumn="0" w:lastColumn="0" w:noHBand="0" w:noVBand="0" w:val="0020"/>
+        <w:jc w:val="start"/>
+        <w:tblBorders>
+          <w:top w:val="single" w:sz="4" w:color="BFBFBF"/>
+          <w:left w:val="single" w:sz="4" w:color="BFBFBF"/>
+          <w:bottom w:val="single" w:sz="4" w:color="BFBFBF"/>
+          <w:right w:val="single" w:sz="4" w:color="BFBFBF"/>
+          <w:insideH w:val="single" w:sz="4" w:color="BFBFBF"/>
+          <w:insideV w:val="single" w:sz="4" w:color="BFBFBF"/>
+        </w:tblBorders>
+      </w:tblPr>
+      <w:tblGrid>
+        <w:gridCol w:w="3960"/>
+        <w:gridCol w:w="3960"/>
+      </w:tblGrid>
+      <w:tr>
+        <w:trPr>
+          <w:tblHeader w:val="true"/>
+        </w:trPr>
+        <w:tc>
+          <w:tcPr>
+            <w:shd w:val="clear" w:fill="B7202E"/>
+          </w:tcPr>
+          <w:p>
+            <w:pPr>
+              <w:pStyle w:val="Compact"/>
+              <w:jc w:val="left"/>
+            </w:pPr>
+            <w:r>
+              <w:rPr>
+                <w:b/>
+                <w:color w:val="FFFFFF"/>
+                <w:sz w:val="20"/>
+              </w:rPr>
+              <w:t xml:space="preserve">Check</w:t>
+            </w:r>
+          </w:p>
+        </w:tc>
+        <w:tc>
+          <w:tcPr>
+            <w:shd w:val="clear" w:fill="B7202E"/>
+          </w:tcPr>
+          <w:p>
+            <w:pPr>
+              <w:pStyle w:val="Compact"/>
+              <w:jc w:val="left"/>
+            </w:pPr>
+            <w:r>
+              <w:rPr>
+                <w:b/>
+                <w:color w:val="FFFFFF"/>
+                <w:sz w:val="20"/>
+              </w:rPr>
+              <w:t xml:space="preserve">Result</w:t>
+            </w:r>
+          </w:p>
+        </w:tc>
+      </w:tr>
+      <w:tr>
+        <w:tc>
+          <w:tcPr/>
+          <w:p>
+            <w:pPr>
+              <w:pStyle w:val="Compact"/>
+              <w:jc w:val="left"/>
+            </w:pPr>
+            <w:r>
+              <w:rPr>
+                <w:sz w:val="20"/>
+              </w:rPr>
+              <w:t xml:space="preserve">Every fact tested in an IF part is a user input or is asserted by some rule (no dead rules)</w:t>
+            </w:r>
+          </w:p>
+        </w:tc>
+        <w:tc>
+          <w:tcPr/>
+          <w:p>
+            <w:pPr>
+              <w:pStyle w:val="Compact"/>
+              <w:jc w:val="left"/>
+            </w:pPr>
+            <w:r>
+              <w:rPr>
+                <w:sz w:val="20"/>
+              </w:rPr>
+              <w:t xml:space="preserve">0 problems</w:t>
+            </w:r>
+          </w:p>
+        </w:tc>
+      </w:tr>
+      <w:tr>
+        <w:tc>
+          <w:tcPr/>
+          <w:p>
+            <w:pPr>
+              <w:pStyle w:val="Compact"/>
+              <w:jc w:val="left"/>
+            </w:pPr>
+            <w:r>
+              <w:rPr>
+                <w:sz w:val="20"/>
+              </w:rPr>
+              <w:t xml:space="preserve">Every rule cites a known source and has a justification</w:t>
+            </w:r>
+          </w:p>
+        </w:tc>
+        <w:tc>
+          <w:tcPr/>
+          <w:p>
+            <w:pPr>
+              <w:pStyle w:val="Compact"/>
+              <w:jc w:val="left"/>
+            </w:pPr>
+            <w:r>
+              <w:rPr>
+                <w:sz w:val="20"/>
+              </w:rPr>
+              <w:t xml:space="preserve">0 problems</w:t>
+            </w:r>
+          </w:p>
+        </w:tc>
+      </w:tr>
+      <w:tr>
+        <w:tc>
+          <w:tcPr/>
+          <w:p>
+            <w:pPr>
+              <w:pStyle w:val="Compact"/>
+              <w:jc w:val="left"/>
+            </w:pPr>
+            <w:r>
+              <w:rPr>
+                <w:sz w:val="20"/>
+              </w:rPr>
+              <w:t xml:space="preserve">Redundancy: two rules with the same IF</w:t>
+            </w:r>
+            <w:r>
+              <w:rPr>
+                <w:sz w:val="20"/>
+              </w:rPr>
+              <w:t xml:space="preserve"> </w:t>
+            </w:r>
+            <w:r>
+              <w:rPr>
+                <w:iCs/>
+                <w:i/>
+                <w:sz w:val="20"/>
+              </w:rPr>
+              <w:t xml:space="preserve">and</w:t>
+            </w:r>
+            <w:r>
+              <w:rPr>
+                <w:sz w:val="20"/>
+              </w:rPr>
+              <w:t xml:space="preserve"> </w:t>
+            </w:r>
+            <w:r>
+              <w:rPr>
+                <w:sz w:val="20"/>
+              </w:rPr>
+              <w:t xml:space="preserve">the same THEN</w:t>
+            </w:r>
+          </w:p>
+        </w:tc>
+        <w:tc>
+          <w:tcPr/>
+          <w:p>
+            <w:pPr>
+              <w:pStyle w:val="Compact"/>
+              <w:jc w:val="left"/>
+            </w:pPr>
+            <w:r>
+              <w:rPr>
+                <w:sz w:val="20"/>
+              </w:rPr>
+              <w:t xml:space="preserve">0 found</w:t>
+            </w:r>
+          </w:p>
+        </w:tc>
+      </w:tr>
+      <w:tr>
+        <w:tc>
+          <w:tcPr/>
+          <w:p>
+            <w:pPr>
+              <w:pStyle w:val="Compact"/>
+              <w:jc w:val="left"/>
+            </w:pPr>
+            <w:r>
+              <w:rPr>
+                <w:sz w:val="20"/>
+              </w:rPr>
+              <w:t xml:space="preserve">Contradiction: two rules with the same IF, different THEN, same salience</w:t>
+            </w:r>
+          </w:p>
+        </w:tc>
+        <w:tc>
+          <w:tcPr/>
+          <w:p>
+            <w:pPr>
+              <w:pStyle w:val="Compact"/>
+              <w:jc w:val="left"/>
+            </w:pPr>
+            <w:r>
+              <w:rPr>
+                <w:sz w:val="20"/>
+              </w:rPr>
+              <w:t xml:space="preserve">0 found</w:t>
+            </w:r>
+          </w:p>
+        </w:tc>
+      </w:tr>
+      <w:tr>
+        <w:tc>
+          <w:tcPr/>
+          <w:p>
+            <w:pPr>
+              <w:pStyle w:val="Compact"/>
+              <w:jc w:val="left"/>
+            </w:pPr>
+            <w:r>
+              <w:rPr>
+                <w:bCs/>
+                <w:b/>
+                <w:sz w:val="20"/>
+              </w:rPr>
+              <w:t xml:space="preserve">Rule coverage</w:t>
+            </w:r>
+            <w:r>
+              <w:rPr>
+                <w:sz w:val="20"/>
+              </w:rPr>
+              <w:t xml:space="preserve">: rules that fire in at least one test scenario</w:t>
+            </w:r>
+          </w:p>
+        </w:tc>
+        <w:tc>
+          <w:tcPr/>
+          <w:p>
+            <w:pPr>
+              <w:pStyle w:val="Compact"/>
+              <w:jc w:val="left"/>
+            </w:pPr>
+            <w:r>
+              <w:rPr>
+                <w:bCs/>
+                <w:b/>
+                <w:sz w:val="20"/>
+              </w:rPr>
+              <w:t xml:space="preserve">59/59 (100 %)</w:t>
+            </w:r>
+          </w:p>
+        </w:tc>
+      </w:tr>
+    </w:tbl>
+    <w:p>
+      <w:pPr>
+        <w:pStyle w:val="BodyText"/>
+      </w:pPr>
+      <w:r>
+        <w:t xml:space="preserve">The checker was itself tested by injecting a duplicate rule, a rule on a non-existent fact, and a contradicting rule. All three defects were reported.</w:t>
+      </w:r>
+    </w:p>
     <w:bookmarkEnd w:id="34"/>
-    <w:bookmarkStart w:id="41" w:name="d3.-implementation"/>
+    <w:bookmarkEnd w:id="35"/>
+    <w:bookmarkStart w:id="42" w:name="d3.-implementation"/>
     <w:p>
       <w:pPr>
         <w:pStyle w:val="Heading1"/>
@@ -12580,7 +12874,7 @@
         <w:t xml:space="preserve">D3. Implementation</w:t>
       </w:r>
     </w:p>
-    <w:bookmarkStart w:id="35" w:name="architecture"/>
+    <w:bookmarkStart w:id="36" w:name="architecture"/>
     <w:p>
       <w:pPr>
         <w:pStyle w:val="Heading2"/>
@@ -12732,8 +13026,8 @@
         <w:t xml:space="preserve">objects with conditions, actions, salience and source), so a domain expert could add a rule without touching the engine.</w:t>
       </w:r>
     </w:p>
-    <w:bookmarkEnd w:id="35"/>
-    <w:bookmarkStart w:id="36" w:name="Xa48a0f39e0ad61bd7a3a0736ed74d63acd24001"/>
+    <w:bookmarkEnd w:id="36"/>
+    <w:bookmarkStart w:id="37" w:name="Xa48a0f39e0ad61bd7a3a0736ed74d63acd24001"/>
     <w:p>
       <w:pPr>
         <w:pStyle w:val="Heading2"/>
@@ -12969,8 +13263,8 @@
         <w:t xml:space="preserve">for facts that the current line of proof needs. For example, it never asks for the normal temperature when Tmax is below the regional threshold. This is ideal for an interactive consultation, and the viva discussion compares the two.</w:t>
       </w:r>
     </w:p>
-    <w:bookmarkEnd w:id="36"/>
-    <w:bookmarkStart w:id="37" w:name="X5b9d6b9be157c3c49e435d7357deff681dc1b67"/>
+    <w:bookmarkEnd w:id="37"/>
+    <w:bookmarkStart w:id="38" w:name="X5b9d6b9be157c3c49e435d7357deff681dc1b67"/>
     <w:p>
       <w:pPr>
         <w:pStyle w:val="Heading2"/>
@@ -13111,8 +13405,8 @@
         <w:t xml:space="preserve">: conditions on missing facts are simply not satisfied, so the engine never crashes on missing input. Implausible values trigger validation rules that HALT with a clear message. A type error inside an action (e.g. text where a number is expected) is caught and reported as an input error.</w:t>
       </w:r>
     </w:p>
-    <w:bookmarkEnd w:id="37"/>
-    <w:bookmarkStart w:id="38" w:name="explanation-facility"/>
+    <w:bookmarkEnd w:id="38"/>
+    <w:bookmarkStart w:id="39" w:name="explanation-facility"/>
     <w:p>
       <w:pPr>
         <w:pStyle w:val="Heading2"/>
@@ -13249,8 +13543,8 @@
         <w:t xml:space="preserve">: every report ends with the guidelines used for that run.</w:t>
       </w:r>
     </w:p>
-    <w:bookmarkEnd w:id="38"/>
-    <w:bookmarkStart w:id="39" w:name="user-interface"/>
+    <w:bookmarkEnd w:id="39"/>
+    <w:bookmarkStart w:id="40" w:name="user-interface"/>
     <w:p>
       <w:pPr>
         <w:pStyle w:val="Heading2"/>
@@ -13571,8 +13865,8 @@
         <w:t xml:space="preserve">and a proof tree.</w:t>
       </w:r>
     </w:p>
-    <w:bookmarkEnd w:id="39"/>
-    <w:bookmarkStart w:id="40" w:name="sample-run-tc09-warm-night-escalation"/>
+    <w:bookmarkEnd w:id="40"/>
+    <w:bookmarkStart w:id="41" w:name="sample-run-tc09-warm-night-escalation"/>
     <w:p>
       <w:pPr>
         <w:pStyle w:val="Heading2"/>
@@ -14171,9 +14465,9 @@
         <w:t xml:space="preserve">========================================================================</w:t>
       </w:r>
     </w:p>
-    <w:bookmarkEnd w:id="40"/>
     <w:bookmarkEnd w:id="41"/>
-    <w:bookmarkStart w:id="45" w:name="d4.-test-case-report"/>
+    <w:bookmarkEnd w:id="42"/>
+    <w:bookmarkStart w:id="46" w:name="d4.-test-case-report"/>
     <w:p>
       <w:pPr>
         <w:pStyle w:val="Heading1"/>
@@ -14206,7 +14500,7 @@
           <w:bCs/>
           <w:b/>
         </w:rPr>
-        <w:t xml:space="preserve">15 scenarios</w:t>
+        <w:t xml:space="preserve">23 scenarios</w:t>
       </w:r>
       <w:r>
         <w:t xml:space="preserve"> </w:t>
@@ -14228,22 +14522,38 @@
         <w:t xml:space="preserve"> </w:t>
       </w:r>
       <w:r>
-        <w:t xml:space="preserve">fire.</w:t>
-      </w:r>
-    </w:p>
-    <w:p>
-      <w:pPr>
-        <w:pStyle w:val="BodyText"/>
-      </w:pPr>
+        <w:t xml:space="preserve">fire. Together the scenarios make</w:t>
+      </w:r>
+      <w:r>
+        <w:t xml:space="preserve"> </w:t>
+      </w:r>
       <w:r>
         <w:rPr>
           <w:bCs/>
           <w:b/>
         </w:rPr>
-        <w:t xml:space="preserve">Result: 25 passed in 0.06s</w:t>
-      </w:r>
-    </w:p>
-    <w:bookmarkStart w:id="42" w:name="summary"/>
+        <w:t xml:space="preserve">every one of the 59 rules fire at least once</w:t>
+      </w:r>
+      <w:r>
+        <w:t xml:space="preserve"> </w:t>
+      </w:r>
+      <w:r>
+        <w:t xml:space="preserve">(rule coverage 59/59 (100 %)). They cover all 4 alert levels, all 4 stakeholder roles, all 3 region types, all 3 heat-illness types, 6 kinds of invalid input, missing optional data, and exact threshold boundaries.</w:t>
+      </w:r>
+    </w:p>
+    <w:p>
+      <w:pPr>
+        <w:pStyle w:val="BodyText"/>
+      </w:pPr>
+      <w:r>
+        <w:rPr>
+          <w:bCs/>
+          <w:b/>
+        </w:rPr>
+        <w:t xml:space="preserve">Result: 1 failed, 34 passed in 0.09s</w:t>
+      </w:r>
+    </w:p>
+    <w:bookmarkStart w:id="43" w:name="summary"/>
     <w:p>
       <w:pPr>
         <w:pStyle w:val="Heading2"/>
@@ -14508,22 +14818,22 @@
               <w:rPr>
                 <w:sz w:val="16"/>
               </w:rPr>
-              <w:t xml:space="preserve">9</w:t>
-            </w:r>
-          </w:p>
-        </w:tc>
-        <w:tc>
-          <w:tcPr/>
-          <w:p>
-            <w:pPr>
-              <w:pStyle w:val="Compact"/>
-              <w:jc w:val="left"/>
-            </w:pPr>
-            <w:r>
-              <w:rPr>
-                <w:sz w:val="16"/>
-              </w:rPr>
-              <w:t xml:space="preserve">PASS</w:t>
+              <w:t xml:space="preserve">10</w:t>
+            </w:r>
+          </w:p>
+        </w:tc>
+        <w:tc>
+          <w:tcPr/>
+          <w:p>
+            <w:pPr>
+              <w:pStyle w:val="Compact"/>
+              <w:jc w:val="left"/>
+            </w:pPr>
+            <w:r>
+              <w:rPr>
+                <w:sz w:val="16"/>
+              </w:rPr>
+              <w:t xml:space="preserve">FAIL</w:t>
             </w:r>
           </w:p>
         </w:tc>
@@ -15529,9 +15839,625 @@
           </w:p>
         </w:tc>
       </w:tr>
+      <w:tr>
+        <w:tc>
+          <w:tcPr/>
+          <w:p>
+            <w:pPr>
+              <w:pStyle w:val="Compact"/>
+              <w:jc w:val="left"/>
+            </w:pPr>
+            <w:r>
+              <w:rPr>
+                <w:sz w:val="16"/>
+              </w:rPr>
+              <w:t xml:space="preserve">TC16</w:t>
+            </w:r>
+          </w:p>
+        </w:tc>
+        <w:tc>
+          <w:tcPr/>
+          <w:p>
+            <w:pPr>
+              <w:pStyle w:val="Compact"/>
+              <w:jc w:val="left"/>
+            </w:pPr>
+            <w:r>
+              <w:rPr>
+                <w:sz w:val="16"/>
+              </w:rPr>
+              <w:t xml:space="preserve">Classic heat stroke (hot, dry skin) reported to health dept</w:t>
+            </w:r>
+          </w:p>
+        </w:tc>
+        <w:tc>
+          <w:tcPr/>
+          <w:p>
+            <w:pPr>
+              <w:pStyle w:val="Compact"/>
+              <w:jc w:val="left"/>
+            </w:pPr>
+            <w:r>
+              <w:rPr>
+                <w:sz w:val="16"/>
+              </w:rPr>
+              <w:t xml:space="preserve">YELLOW / heatwave + EMERGENCY</w:t>
+            </w:r>
+          </w:p>
+        </w:tc>
+        <w:tc>
+          <w:tcPr/>
+          <w:p>
+            <w:pPr>
+              <w:pStyle w:val="Compact"/>
+              <w:jc w:val="left"/>
+            </w:pPr>
+            <w:r>
+              <w:rPr>
+                <w:sz w:val="16"/>
+              </w:rPr>
+              <w:t xml:space="preserve">11</w:t>
+            </w:r>
+          </w:p>
+        </w:tc>
+        <w:tc>
+          <w:tcPr/>
+          <w:p>
+            <w:pPr>
+              <w:pStyle w:val="Compact"/>
+              <w:jc w:val="left"/>
+            </w:pPr>
+            <w:r>
+              <w:rPr>
+                <w:sz w:val="16"/>
+              </w:rPr>
+              <w:t xml:space="preserve">PASS</w:t>
+            </w:r>
+          </w:p>
+        </w:tc>
+      </w:tr>
+      <w:tr>
+        <w:tc>
+          <w:tcPr/>
+          <w:p>
+            <w:pPr>
+              <w:pStyle w:val="Compact"/>
+              <w:jc w:val="left"/>
+            </w:pPr>
+            <w:r>
+              <w:rPr>
+                <w:sz w:val="16"/>
+              </w:rPr>
+              <w:t xml:space="preserve">TC17</w:t>
+            </w:r>
+          </w:p>
+        </w:tc>
+        <w:tc>
+          <w:tcPr/>
+          <w:p>
+            <w:pPr>
+              <w:pStyle w:val="Compact"/>
+              <w:jc w:val="left"/>
+            </w:pPr>
+            <w:r>
+              <w:rPr>
+                <w:sz w:val="16"/>
+              </w:rPr>
+              <w:t xml:space="preserve">Heat exhaustion on a normal day (exertional)</w:t>
+            </w:r>
+          </w:p>
+        </w:tc>
+        <w:tc>
+          <w:tcPr/>
+          <w:p>
+            <w:pPr>
+              <w:pStyle w:val="Compact"/>
+              <w:jc w:val="left"/>
+            </w:pPr>
+            <w:r>
+              <w:rPr>
+                <w:sz w:val="16"/>
+              </w:rPr>
+              <w:t xml:space="preserve">GREEN / none</w:t>
+            </w:r>
+          </w:p>
+        </w:tc>
+        <w:tc>
+          <w:tcPr/>
+          <w:p>
+            <w:pPr>
+              <w:pStyle w:val="Compact"/>
+              <w:jc w:val="left"/>
+            </w:pPr>
+            <w:r>
+              <w:rPr>
+                <w:sz w:val="16"/>
+              </w:rPr>
+              <w:t xml:space="preserve">9</w:t>
+            </w:r>
+          </w:p>
+        </w:tc>
+        <w:tc>
+          <w:tcPr/>
+          <w:p>
+            <w:pPr>
+              <w:pStyle w:val="Compact"/>
+              <w:jc w:val="left"/>
+            </w:pPr>
+            <w:r>
+              <w:rPr>
+                <w:sz w:val="16"/>
+              </w:rPr>
+              <w:t xml:space="preserve">PASS</w:t>
+            </w:r>
+          </w:p>
+        </w:tc>
+      </w:tr>
+      <w:tr>
+        <w:tc>
+          <w:tcPr/>
+          <w:p>
+            <w:pPr>
+              <w:pStyle w:val="Compact"/>
+              <w:jc w:val="left"/>
+            </w:pPr>
+            <w:r>
+              <w:rPr>
+                <w:sz w:val="16"/>
+              </w:rPr>
+              <w:t xml:space="preserve">TC18</w:t>
+            </w:r>
+          </w:p>
+        </w:tc>
+        <w:tc>
+          <w:tcPr/>
+          <w:p>
+            <w:pPr>
+              <w:pStyle w:val="Compact"/>
+              <w:jc w:val="left"/>
+            </w:pPr>
+            <w:r>
+              <w:rPr>
+                <w:sz w:val="16"/>
+              </w:rPr>
+              <w:t xml:space="preserve">Farmer on a normal day - routine advice only</w:t>
+            </w:r>
+          </w:p>
+        </w:tc>
+        <w:tc>
+          <w:tcPr/>
+          <w:p>
+            <w:pPr>
+              <w:pStyle w:val="Compact"/>
+              <w:jc w:val="left"/>
+            </w:pPr>
+            <w:r>
+              <w:rPr>
+                <w:sz w:val="16"/>
+              </w:rPr>
+              <w:t xml:space="preserve">GREEN / none</w:t>
+            </w:r>
+          </w:p>
+        </w:tc>
+        <w:tc>
+          <w:tcPr/>
+          <w:p>
+            <w:pPr>
+              <w:pStyle w:val="Compact"/>
+              <w:jc w:val="left"/>
+            </w:pPr>
+            <w:r>
+              <w:rPr>
+                <w:sz w:val="16"/>
+              </w:rPr>
+              <w:t xml:space="preserve">7</w:t>
+            </w:r>
+          </w:p>
+        </w:tc>
+        <w:tc>
+          <w:tcPr/>
+          <w:p>
+            <w:pPr>
+              <w:pStyle w:val="Compact"/>
+              <w:jc w:val="left"/>
+            </w:pPr>
+            <w:r>
+              <w:rPr>
+                <w:sz w:val="16"/>
+              </w:rPr>
+              <w:t xml:space="preserve">PASS</w:t>
+            </w:r>
+          </w:p>
+        </w:tc>
+      </w:tr>
+      <w:tr>
+        <w:tc>
+          <w:tcPr/>
+          <w:p>
+            <w:pPr>
+              <w:pStyle w:val="Compact"/>
+              <w:jc w:val="left"/>
+            </w:pPr>
+            <w:r>
+              <w:rPr>
+                <w:sz w:val="16"/>
+              </w:rPr>
+              <w:t xml:space="preserve">TC19</w:t>
+            </w:r>
+          </w:p>
+        </w:tc>
+        <w:tc>
+          <w:tcPr/>
+          <w:p>
+            <w:pPr>
+              <w:pStyle w:val="Compact"/>
+              <w:jc w:val="left"/>
+            </w:pPr>
+            <w:r>
+              <w:rPr>
+                <w:sz w:val="16"/>
+              </w:rPr>
+              <w:t xml:space="preserve">Health department on a normal day</w:t>
+            </w:r>
+          </w:p>
+        </w:tc>
+        <w:tc>
+          <w:tcPr/>
+          <w:p>
+            <w:pPr>
+              <w:pStyle w:val="Compact"/>
+              <w:jc w:val="left"/>
+            </w:pPr>
+            <w:r>
+              <w:rPr>
+                <w:sz w:val="16"/>
+              </w:rPr>
+              <w:t xml:space="preserve">GREEN / none</w:t>
+            </w:r>
+          </w:p>
+        </w:tc>
+        <w:tc>
+          <w:tcPr/>
+          <w:p>
+            <w:pPr>
+              <w:pStyle w:val="Compact"/>
+              <w:jc w:val="left"/>
+            </w:pPr>
+            <w:r>
+              <w:rPr>
+                <w:sz w:val="16"/>
+              </w:rPr>
+              <w:t xml:space="preserve">7</w:t>
+            </w:r>
+          </w:p>
+        </w:tc>
+        <w:tc>
+          <w:tcPr/>
+          <w:p>
+            <w:pPr>
+              <w:pStyle w:val="Compact"/>
+              <w:jc w:val="left"/>
+            </w:pPr>
+            <w:r>
+              <w:rPr>
+                <w:sz w:val="16"/>
+              </w:rPr>
+              <w:t xml:space="preserve">PASS</w:t>
+            </w:r>
+          </w:p>
+        </w:tc>
+      </w:tr>
+      <w:tr>
+        <w:tc>
+          <w:tcPr/>
+          <w:p>
+            <w:pPr>
+              <w:pStyle w:val="Compact"/>
+              <w:jc w:val="left"/>
+            </w:pPr>
+            <w:r>
+              <w:rPr>
+                <w:sz w:val="16"/>
+              </w:rPr>
+              <w:t xml:space="preserve">TC20</w:t>
+            </w:r>
+          </w:p>
+        </w:tc>
+        <w:tc>
+          <w:tcPr/>
+          <w:p>
+            <w:pPr>
+              <w:pStyle w:val="Compact"/>
+              <w:jc w:val="left"/>
+            </w:pPr>
+            <w:r>
+              <w:rPr>
+                <w:sz w:val="16"/>
+              </w:rPr>
+              <w:t xml:space="preserve">Invalid humidity (140 %) - graceful halt</w:t>
+            </w:r>
+          </w:p>
+        </w:tc>
+        <w:tc>
+          <w:tcPr/>
+          <w:p>
+            <w:pPr>
+              <w:pStyle w:val="Compact"/>
+              <w:jc w:val="left"/>
+            </w:pPr>
+            <w:r>
+              <w:rPr>
+                <w:sz w:val="16"/>
+              </w:rPr>
+              <w:t xml:space="preserve">ERROR (halt V3)</w:t>
+            </w:r>
+          </w:p>
+        </w:tc>
+        <w:tc>
+          <w:tcPr/>
+          <w:p>
+            <w:pPr>
+              <w:pStyle w:val="Compact"/>
+              <w:jc w:val="left"/>
+            </w:pPr>
+            <w:r>
+              <w:rPr>
+                <w:sz w:val="16"/>
+              </w:rPr>
+              <w:t xml:space="preserve">1</w:t>
+            </w:r>
+          </w:p>
+        </w:tc>
+        <w:tc>
+          <w:tcPr/>
+          <w:p>
+            <w:pPr>
+              <w:pStyle w:val="Compact"/>
+              <w:jc w:val="left"/>
+            </w:pPr>
+            <w:r>
+              <w:rPr>
+                <w:sz w:val="16"/>
+              </w:rPr>
+              <w:t xml:space="preserve">PASS</w:t>
+            </w:r>
+          </w:p>
+        </w:tc>
+      </w:tr>
+      <w:tr>
+        <w:tc>
+          <w:tcPr/>
+          <w:p>
+            <w:pPr>
+              <w:pStyle w:val="Compact"/>
+              <w:jc w:val="left"/>
+            </w:pPr>
+            <w:r>
+              <w:rPr>
+                <w:sz w:val="16"/>
+              </w:rPr>
+              <w:t xml:space="preserve">TC21</w:t>
+            </w:r>
+          </w:p>
+        </w:tc>
+        <w:tc>
+          <w:tcPr/>
+          <w:p>
+            <w:pPr>
+              <w:pStyle w:val="Compact"/>
+              <w:jc w:val="left"/>
+            </w:pPr>
+            <w:r>
+              <w:rPr>
+                <w:sz w:val="16"/>
+              </w:rPr>
+              <w:t xml:space="preserve">Implausible normal temperature (70 C) - graceful halt</w:t>
+            </w:r>
+          </w:p>
+        </w:tc>
+        <w:tc>
+          <w:tcPr/>
+          <w:p>
+            <w:pPr>
+              <w:pStyle w:val="Compact"/>
+              <w:jc w:val="left"/>
+            </w:pPr>
+            <w:r>
+              <w:rPr>
+                <w:sz w:val="16"/>
+              </w:rPr>
+              <w:t xml:space="preserve">ERROR (halt V2)</w:t>
+            </w:r>
+          </w:p>
+        </w:tc>
+        <w:tc>
+          <w:tcPr/>
+          <w:p>
+            <w:pPr>
+              <w:pStyle w:val="Compact"/>
+              <w:jc w:val="left"/>
+            </w:pPr>
+            <w:r>
+              <w:rPr>
+                <w:sz w:val="16"/>
+              </w:rPr>
+              <w:t xml:space="preserve">1</w:t>
+            </w:r>
+          </w:p>
+        </w:tc>
+        <w:tc>
+          <w:tcPr/>
+          <w:p>
+            <w:pPr>
+              <w:pStyle w:val="Compact"/>
+              <w:jc w:val="left"/>
+            </w:pPr>
+            <w:r>
+              <w:rPr>
+                <w:sz w:val="16"/>
+              </w:rPr>
+              <w:t xml:space="preserve">PASS</w:t>
+            </w:r>
+          </w:p>
+        </w:tc>
+      </w:tr>
+      <w:tr>
+        <w:tc>
+          <w:tcPr/>
+          <w:p>
+            <w:pPr>
+              <w:pStyle w:val="Compact"/>
+              <w:jc w:val="left"/>
+            </w:pPr>
+            <w:r>
+              <w:rPr>
+                <w:sz w:val="16"/>
+              </w:rPr>
+              <w:t xml:space="preserve">TC22</w:t>
+            </w:r>
+          </w:p>
+        </w:tc>
+        <w:tc>
+          <w:tcPr/>
+          <w:p>
+            <w:pPr>
+              <w:pStyle w:val="Compact"/>
+              <w:jc w:val="left"/>
+            </w:pPr>
+            <w:r>
+              <w:rPr>
+                <w:sz w:val="16"/>
+              </w:rPr>
+              <w:t xml:space="preserve">Invalid persistence (0 days) - graceful halt</w:t>
+            </w:r>
+          </w:p>
+        </w:tc>
+        <w:tc>
+          <w:tcPr/>
+          <w:p>
+            <w:pPr>
+              <w:pStyle w:val="Compact"/>
+              <w:jc w:val="left"/>
+            </w:pPr>
+            <w:r>
+              <w:rPr>
+                <w:sz w:val="16"/>
+              </w:rPr>
+              <w:t xml:space="preserve">ERROR (halt V4)</w:t>
+            </w:r>
+          </w:p>
+        </w:tc>
+        <w:tc>
+          <w:tcPr/>
+          <w:p>
+            <w:pPr>
+              <w:pStyle w:val="Compact"/>
+              <w:jc w:val="left"/>
+            </w:pPr>
+            <w:r>
+              <w:rPr>
+                <w:sz w:val="16"/>
+              </w:rPr>
+              <w:t xml:space="preserve">1</w:t>
+            </w:r>
+          </w:p>
+        </w:tc>
+        <w:tc>
+          <w:tcPr/>
+          <w:p>
+            <w:pPr>
+              <w:pStyle w:val="Compact"/>
+              <w:jc w:val="left"/>
+            </w:pPr>
+            <w:r>
+              <w:rPr>
+                <w:sz w:val="16"/>
+              </w:rPr>
+              <w:t xml:space="preserve">PASS</w:t>
+            </w:r>
+          </w:p>
+        </w:tc>
+      </w:tr>
+      <w:tr>
+        <w:tc>
+          <w:tcPr/>
+          <w:p>
+            <w:pPr>
+              <w:pStyle w:val="Compact"/>
+              <w:jc w:val="left"/>
+            </w:pPr>
+            <w:r>
+              <w:rPr>
+                <w:sz w:val="16"/>
+              </w:rPr>
+              <w:t xml:space="preserve">TC23</w:t>
+            </w:r>
+          </w:p>
+        </w:tc>
+        <w:tc>
+          <w:tcPr/>
+          <w:p>
+            <w:pPr>
+              <w:pStyle w:val="Compact"/>
+              <w:jc w:val="left"/>
+            </w:pPr>
+            <w:r>
+              <w:rPr>
+                <w:sz w:val="16"/>
+              </w:rPr>
+              <w:t xml:space="preserve">Heat wave persisting 5 days - Orange for authority</w:t>
+            </w:r>
+          </w:p>
+        </w:tc>
+        <w:tc>
+          <w:tcPr/>
+          <w:p>
+            <w:pPr>
+              <w:pStyle w:val="Compact"/>
+              <w:jc w:val="left"/>
+            </w:pPr>
+            <w:r>
+              <w:rPr>
+                <w:sz w:val="16"/>
+              </w:rPr>
+              <w:t xml:space="preserve">ORANGE / heatwave</w:t>
+            </w:r>
+          </w:p>
+        </w:tc>
+        <w:tc>
+          <w:tcPr/>
+          <w:p>
+            <w:pPr>
+              <w:pStyle w:val="Compact"/>
+              <w:jc w:val="left"/>
+            </w:pPr>
+            <w:r>
+              <w:rPr>
+                <w:sz w:val="16"/>
+              </w:rPr>
+              <w:t xml:space="preserve">9</w:t>
+            </w:r>
+          </w:p>
+        </w:tc>
+        <w:tc>
+          <w:tcPr/>
+          <w:p>
+            <w:pPr>
+              <w:pStyle w:val="Compact"/>
+              <w:jc w:val="left"/>
+            </w:pPr>
+            <w:r>
+              <w:rPr>
+                <w:sz w:val="16"/>
+              </w:rPr>
+              <w:t xml:space="preserve">PASS</w:t>
+            </w:r>
+          </w:p>
+        </w:tc>
+      </w:tr>
     </w:tbl>
-    <w:bookmarkEnd w:id="42"/>
-    <w:bookmarkStart w:id="43" w:name="detailed-scenarios"/>
+    <w:bookmarkEnd w:id="43"/>
+    <w:bookmarkStart w:id="44" w:name="detailed-scenarios"/>
     <w:p>
       <w:pPr>
         <w:pStyle w:val="Heading2"/>
@@ -15747,7 +16673,7 @@
         <w:t xml:space="preserve"> </w:t>
       </w:r>
       <w:r>
-        <w:t xml:space="preserve">D1 → D3 → H3 → C8 → A1 → E2 → P4 → P2 → K1</w:t>
+        <w:t xml:space="preserve">D1 → D3 → C2 → H3 → C8 → A1 → E2 → P4 → P2 → K1</w:t>
       </w:r>
     </w:p>
     <w:p>
@@ -15795,7 +16721,7 @@
           <w:bCs/>
           <w:b/>
         </w:rPr>
-        <w:t xml:space="preserve">PASS</w:t>
+        <w:t xml:space="preserve">FAIL</w:t>
       </w:r>
     </w:p>
     <w:p>
@@ -17475,58 +18401,16 @@
         <w:t xml:space="preserve">PASS</w:t>
       </w:r>
     </w:p>
-    <w:bookmarkEnd w:id="43"/>
-    <w:bookmarkStart w:id="44" w:name="cross-check-with-the-prolog-edition"/>
-    <w:p>
-      <w:pPr>
-        <w:pStyle w:val="Heading2"/>
-      </w:pPr>
-      <w:r>
-        <w:t xml:space="preserve">4.3 Cross-check with the Prolog edition</w:t>
-      </w:r>
-    </w:p>
     <w:p>
       <w:pPr>
         <w:pStyle w:val="FirstParagraph"/>
       </w:pPr>
-      <w:r>
-        <w:t xml:space="preserve">Scenarios TC01, TC02, TC03, TC04, TC06 and TC09 were also run through the backward-chaining Prolog edition (</w:t>
-      </w:r>
-      <w:r>
-        <w:rPr>
-          <w:rStyle w:val="VerbatimChar"/>
-        </w:rPr>
-        <w:t xml:space="preserve">?- run_tests_cases.</w:t>
-      </w:r>
-      <w:r>
-        <w:t xml:space="preserve">). It produced</w:t>
-      </w:r>
-      <w:r>
-        <w:t xml:space="preserve"> </w:t>
-      </w:r>
       <w:r>
         <w:rPr>
           <w:bCs/>
           <w:b/>
         </w:rPr>
-        <w:t xml:space="preserve">the same alert levels</w:t>
-      </w:r>
-      <w:r>
-        <w:t xml:space="preserve"> </w:t>
-      </w:r>
-      <w:r>
-        <w:t xml:space="preserve">(Green, Yellow, Red, Yellow-watch, Yellow + emergency, Orange), which shows that the knowledge is independent of the inference strategy.</w:t>
-      </w:r>
-    </w:p>
-    <w:bookmarkEnd w:id="44"/>
-    <w:bookmarkEnd w:id="45"/>
-    <w:bookmarkStart w:id="46" w:name="d5.-demo-plan-live-run-2-3-queries"/>
-    <w:p>
-      <w:pPr>
-        <w:pStyle w:val="Heading1"/>
-      </w:pPr>
-      <w:r>
-        <w:t xml:space="preserve">D5. Demo Plan (live run, 2-3 queries)</w:t>
+        <w:t xml:space="preserve">TC16: Classic heat stroke (hot, dry skin) reported to health dept</w:t>
       </w:r>
     </w:p>
     <w:p>
@@ -17539,39 +18423,19 @@
       </w:pPr>
       <w:r>
         <w:rPr>
-          <w:bCs/>
-          <w:b/>
-        </w:rPr>
-        <w:t xml:space="preserve">Normal vs. watch vs. declared</w:t>
-      </w:r>
-      <w:r>
-        <w:t xml:space="preserve">: TC01 (Green) → TC04 (Yellow</w:t>
-      </w:r>
-      <w:r>
-        <w:t xml:space="preserve"> </w:t>
-      </w:r>
-      <w:r>
-        <w:rPr>
           <w:iCs/>
           <w:i/>
         </w:rPr>
-        <w:t xml:space="preserve">watch</w:t>
-      </w:r>
-      <w:r>
-        <w:t xml:space="preserve">, day 1) → change days to 3 (Yellow</w:t>
-      </w:r>
-      <w:r>
-        <w:t xml:space="preserve"> </w:t>
-      </w:r>
-      <w:r>
-        <w:rPr>
-          <w:iCs/>
-          <w:i/>
-        </w:rPr>
-        <w:t xml:space="preserve">declared</w:t>
-      </w:r>
-      <w:r>
-        <w:t xml:space="preserve">). Shows the IMD persistence rule.</w:t>
+        <w:t xml:space="preserve">Inputs:</w:t>
+      </w:r>
+      <w:r>
+        <w:t xml:space="preserve"> </w:t>
+      </w:r>
+      <w:r>
+        <w:rPr>
+          <w:rStyle w:val="VerbatimChar"/>
+        </w:rPr>
+        <w:t xml:space="preserve">role=health, region=plains, tmax=44.0, tmax_normal=39.0, heat_days=2, rh=20, symptoms=high_body_temp/no_sweating</w:t>
       </w:r>
     </w:p>
     <w:p>
@@ -17584,28 +18448,16 @@
       </w:pPr>
       <w:r>
         <w:rPr>
-          <w:bCs/>
-          <w:b/>
-        </w:rPr>
-        <w:t xml:space="preserve">Escalation and HOW</w:t>
-      </w:r>
-      <w:r>
-        <w:t xml:space="preserve">: TC09. Show the trace, then type</w:t>
-      </w:r>
-      <w:r>
-        <w:t xml:space="preserve"> </w:t>
-      </w:r>
-      <w:r>
-        <w:rPr>
-          <w:rStyle w:val="VerbatimChar"/>
-        </w:rPr>
-        <w:t xml:space="preserve">how alert</w:t>
-      </w:r>
-      <w:r>
-        <w:t xml:space="preserve"> </w:t>
-      </w:r>
-      <w:r>
-        <w:t xml:space="preserve">to see Yellow (A3) → Orange (E1, warm night).</w:t>
+          <w:iCs/>
+          <w:i/>
+        </w:rPr>
+        <w:t xml:space="preserve">Expected:</w:t>
+      </w:r>
+      <w:r>
+        <w:t xml:space="preserve"> </w:t>
+      </w:r>
+      <w:r>
+        <w:t xml:space="preserve">alert = YELLOW, hri = heat_stroke, emergency = True</w:t>
       </w:r>
     </w:p>
     <w:p>
@@ -17618,13 +18470,16 @@
       </w:pPr>
       <w:r>
         <w:rPr>
-          <w:bCs/>
-          <w:b/>
-        </w:rPr>
-        <w:t xml:space="preserve">Robustness and life safety</w:t>
-      </w:r>
-      <w:r>
-        <w:t xml:space="preserve">: enter Tmax = 62 (V1 halts with a clear message), then TC06 (heat-stroke symptoms → EMERGENCY advice fires first).</w:t>
+          <w:iCs/>
+          <w:i/>
+        </w:rPr>
+        <w:t xml:space="preserve">Rules fired (in order):</w:t>
+      </w:r>
+      <w:r>
+        <w:t xml:space="preserve"> </w:t>
+      </w:r>
+      <w:r>
+        <w:t xml:space="preserve">T2 → T5 → D1 → D3 → C1 → H3 → C7 → A3 → G3 → M1 → K1</w:t>
       </w:r>
     </w:p>
     <w:p>
@@ -17640,208 +18495,51 @@
           <w:iCs/>
           <w:i/>
         </w:rPr>
-        <w:t xml:space="preserve">(Optional)</w:t>
-      </w:r>
-      <w:r>
-        <w:t xml:space="preserve"> </w:t>
-      </w:r>
-      <w:r>
-        <w:t xml:space="preserve">The same consultation in Prolog: type</w:t>
-      </w:r>
-      <w:r>
-        <w:t xml:space="preserve"> </w:t>
-      </w:r>
-      <w:r>
-        <w:rPr>
-          <w:rStyle w:val="VerbatimChar"/>
-        </w:rPr>
-        <w:t xml:space="preserve">why</w:t>
-      </w:r>
-      <w:r>
-        <w:t xml:space="preserve"> </w:t>
-      </w:r>
-      <w:r>
-        <w:t xml:space="preserve">at the</w:t>
-      </w:r>
-      <w:r>
-        <w:t xml:space="preserve"> </w:t>
-      </w:r>
-      <w:r>
-        <w:t xml:space="preserve">“</w:t>
-      </w:r>
-      <w:r>
-        <w:t xml:space="preserve">normal temperature</w:t>
-      </w:r>
-      <w:r>
-        <w:t xml:space="preserve">”</w:t>
-      </w:r>
-      <w:r>
-        <w:t xml:space="preserve"> </w:t>
-      </w:r>
-      <w:r>
-        <w:t xml:space="preserve">question to show the goal stack.</w:t>
-      </w:r>
-    </w:p>
-    <w:bookmarkEnd w:id="46"/>
-    <w:bookmarkStart w:id="47" w:name="X09b687f8bca004250b8de0292798cb02b0c9c55"/>
-    <w:p>
-      <w:pPr>
-        <w:pStyle w:val="Heading1"/>
-      </w:pPr>
-      <w:r>
-        <w:t xml:space="preserve">D6. Reflection Notes (individual, ½ page each)</w:t>
-      </w:r>
-    </w:p>
-    <w:p>
-      <w:pPr>
-        <w:pStyle w:val="FirstParagraph"/>
+        <w:t xml:space="preserve">Output:</w:t>
+      </w:r>
+      <w:r>
+        <w:t xml:space="preserve"> </w:t>
+      </w:r>
+      <w:r>
+        <w:t xml:space="preserve">YELLOW ALERT (Heat alert - be updated) - IMD category: heatwave; advice for: EMERGENCY, HEALTH, NOTE</w:t>
+      </w:r>
+    </w:p>
+    <w:p>
+      <w:pPr>
+        <w:numPr>
+          <w:ilvl w:val="0"/>
+          <w:numId w:val="1025"/>
+        </w:numPr>
+        <w:pStyle w:val="Compact"/>
       </w:pPr>
       <w:r>
         <w:rPr>
           <w:iCs/>
           <w:i/>
         </w:rPr>
-        <w:t xml:space="preserve">Each member writes this section separately in their own words. The prompts below are a guide.</w:t>
-      </w:r>
-    </w:p>
-    <w:p>
-      <w:pPr>
-        <w:pStyle w:val="BodyText"/>
-      </w:pPr>
+        <w:t xml:space="preserve">Result:</w:t>
+      </w:r>
+      <w:r>
+        <w:t xml:space="preserve"> </w:t>
+      </w:r>
       <w:r>
         <w:rPr>
           <w:bCs/>
           <w:b/>
         </w:rPr>
-        <w:t xml:space="preserve">Member 1, ____________ (Roll No. ______)</w:t>
-      </w:r>
-      <w:r>
-        <w:t xml:space="preserve"> </w:t>
-      </w:r>
-      <w:r>
-        <w:rPr>
-          <w:iCs/>
-          <w:i/>
-        </w:rPr>
-        <w:t xml:space="preserve">Contribution:</w:t>
-      </w:r>
-      <w:r>
-        <w:t xml:space="preserve"> </w:t>
-      </w:r>
-      <w:r>
-        <w:t xml:space="preserve">______________________________________________</w:t>
-      </w:r>
-      <w:r>
-        <w:t xml:space="preserve"> </w:t>
-      </w:r>
-      <w:r>
-        <w:rPr>
-          <w:iCs/>
-          <w:i/>
-        </w:rPr>
-        <w:t xml:space="preserve">One limitation of rule-based systems observed:</w:t>
-      </w:r>
-      <w:r>
-        <w:t xml:space="preserve"> </w:t>
-      </w:r>
-      <w:r>
-        <w:t xml:space="preserve">______________________________________________</w:t>
-      </w:r>
-    </w:p>
-    <w:p>
-      <w:pPr>
-        <w:pStyle w:val="BodyText"/>
+        <w:t xml:space="preserve">PASS</w:t>
+      </w:r>
+    </w:p>
+    <w:p>
+      <w:pPr>
+        <w:pStyle w:val="FirstParagraph"/>
       </w:pPr>
       <w:r>
         <w:rPr>
           <w:bCs/>
           <w:b/>
         </w:rPr>
-        <w:t xml:space="preserve">Member 2, ____________ (Roll No. ______)</w:t>
-      </w:r>
-      <w:r>
-        <w:t xml:space="preserve"> </w:t>
-      </w:r>
-      <w:r>
-        <w:rPr>
-          <w:iCs/>
-          <w:i/>
-        </w:rPr>
-        <w:t xml:space="preserve">Contribution:</w:t>
-      </w:r>
-      <w:r>
-        <w:t xml:space="preserve"> </w:t>
-      </w:r>
-      <w:r>
-        <w:t xml:space="preserve">______________________________________________</w:t>
-      </w:r>
-      <w:r>
-        <w:t xml:space="preserve"> </w:t>
-      </w:r>
-      <w:r>
-        <w:rPr>
-          <w:iCs/>
-          <w:i/>
-        </w:rPr>
-        <w:t xml:space="preserve">One limitation of rule-based systems observed:</w:t>
-      </w:r>
-      <w:r>
-        <w:t xml:space="preserve"> </w:t>
-      </w:r>
-      <w:r>
-        <w:t xml:space="preserve">______________________________________________</w:t>
-      </w:r>
-    </w:p>
-    <w:p>
-      <w:pPr>
-        <w:pStyle w:val="BodyText"/>
-      </w:pPr>
-      <w:r>
-        <w:rPr>
-          <w:bCs/>
-          <w:b/>
-        </w:rPr>
-        <w:t xml:space="preserve">Member 3, ____________ (Roll No. ______)</w:t>
-      </w:r>
-      <w:r>
-        <w:t xml:space="preserve"> </w:t>
-      </w:r>
-      <w:r>
-        <w:rPr>
-          <w:iCs/>
-          <w:i/>
-        </w:rPr>
-        <w:t xml:space="preserve">Contribution:</w:t>
-      </w:r>
-      <w:r>
-        <w:t xml:space="preserve"> </w:t>
-      </w:r>
-      <w:r>
-        <w:t xml:space="preserve">______________________________________________</w:t>
-      </w:r>
-      <w:r>
-        <w:t xml:space="preserve"> </w:t>
-      </w:r>
-      <w:r>
-        <w:rPr>
-          <w:iCs/>
-          <w:i/>
-        </w:rPr>
-        <w:t xml:space="preserve">One limitation of rule-based systems observed:</w:t>
-      </w:r>
-      <w:r>
-        <w:t xml:space="preserve"> </w:t>
-      </w:r>
-      <w:r>
-        <w:t xml:space="preserve">______________________________________________</w:t>
-      </w:r>
-    </w:p>
-    <w:p>
-      <w:pPr>
-        <w:pStyle w:val="BodyText"/>
-      </w:pPr>
-      <w:r>
-        <w:t xml:space="preserve">Limitations we observed, for members to choose from and expand:</w:t>
+        <w:t xml:space="preserve">TC17: Heat exhaustion on a normal day (exertional)</w:t>
       </w:r>
     </w:p>
     <w:p>
@@ -17854,48 +18552,19 @@
       </w:pPr>
       <w:r>
         <w:rPr>
-          <w:bCs/>
-          <w:b/>
-        </w:rPr>
-        <w:t xml:space="preserve">Brittle crisp thresholds.</w:t>
-      </w:r>
-      <w:r>
-        <w:t xml:space="preserve"> </w:t>
-      </w:r>
-      <w:r>
-        <w:t xml:space="preserve">39.9 °C gives</w:t>
-      </w:r>
-      <w:r>
-        <w:t xml:space="preserve"> </w:t>
-      </w:r>
-      <w:r>
-        <w:rPr>
           <w:iCs/>
           <w:i/>
         </w:rPr>
-        <w:t xml:space="preserve">Green</w:t>
-      </w:r>
-      <w:r>
-        <w:t xml:space="preserve"> </w:t>
-      </w:r>
-      <w:r>
-        <w:t xml:space="preserve">and 40.0 °C gives</w:t>
-      </w:r>
-      <w:r>
-        <w:t xml:space="preserve"> </w:t>
-      </w:r>
-      <w:r>
-        <w:rPr>
-          <w:iCs/>
-          <w:i/>
-        </w:rPr>
-        <w:t xml:space="preserve">Yellow</w:t>
-      </w:r>
-      <w:r>
-        <w:t xml:space="preserve"> </w:t>
-      </w:r>
-      <w:r>
-        <w:t xml:space="preserve">(TC11 vs. TC12). Real risk is continuous, and fuzzy logic or certainty factors would model it better.</w:t>
+        <w:t xml:space="preserve">Inputs:</w:t>
+      </w:r>
+      <w:r>
+        <w:t xml:space="preserve"> </w:t>
+      </w:r>
+      <w:r>
+        <w:rPr>
+          <w:rStyle w:val="VerbatimChar"/>
+        </w:rPr>
+        <w:t xml:space="preserve">role=citizen, region=plains, tmax=34.0, tmax_normal=33.0, heat_days=1, rh=30, symptoms=heavy_sweating/dizziness</w:t>
       </w:r>
     </w:p>
     <w:p>
@@ -17908,41 +18577,16 @@
       </w:pPr>
       <w:r>
         <w:rPr>
-          <w:bCs/>
-          <w:b/>
-        </w:rPr>
-        <w:t xml:space="preserve">The knowledge-acquisition bottleneck.</w:t>
-      </w:r>
-      <w:r>
-        <w:t xml:space="preserve"> </w:t>
-      </w:r>
-      <w:r>
-        <w:t xml:space="preserve">IMD defines the colour code in words (</w:t>
-      </w:r>
-      <w:r>
-        <w:t xml:space="preserve">“</w:t>
-      </w:r>
-      <w:r>
-        <w:t xml:space="preserve">persists for more than 2 days</w:t>
-      </w:r>
-      <w:r>
-        <w:t xml:space="preserve">”</w:t>
-      </w:r>
-      <w:r>
-        <w:t xml:space="preserve">), and turning these into rules forced us to make choices. Day-1 severe heat had to become a</w:t>
-      </w:r>
-      <w:r>
-        <w:t xml:space="preserve"> </w:t>
-      </w:r>
-      <w:r>
-        <w:rPr>
           <w:iCs/>
           <w:i/>
         </w:rPr>
-        <w:t xml:space="preserve">watch</w:t>
-      </w:r>
-      <w:r>
-        <w:t xml:space="preserve">, and the case where the duration is unknown needed its own rule (A8).</w:t>
+        <w:t xml:space="preserve">Expected:</w:t>
+      </w:r>
+      <w:r>
+        <w:t xml:space="preserve"> </w:t>
+      </w:r>
+      <w:r>
+        <w:t xml:space="preserve">alert = GREEN, hri = heat_exhaustion</w:t>
       </w:r>
     </w:p>
     <w:p>
@@ -17955,16 +18599,16 @@
       </w:pPr>
       <w:r>
         <w:rPr>
-          <w:bCs/>
-          <w:b/>
-        </w:rPr>
-        <w:t xml:space="preserve">Rule interaction is hard to reason about.</w:t>
-      </w:r>
-      <w:r>
-        <w:t xml:space="preserve"> </w:t>
-      </w:r>
-      <w:r>
-        <w:t xml:space="preserve">Our first version escalated hot, dry 44 °C days to Orange, because the Rothfusz heat-index formula exaggerates heat stress in very dry air. Adding the RH ≥ 40 % condition to E3 fixed it, but the bug appeared only through testing.</w:t>
+          <w:iCs/>
+          <w:i/>
+        </w:rPr>
+        <w:t xml:space="preserve">Rules fired (in order):</w:t>
+      </w:r>
+      <w:r>
+        <w:t xml:space="preserve"> </w:t>
+      </w:r>
+      <w:r>
+        <w:t xml:space="preserve">T3 → T6 → D1 → D3 → H2 → C8 → A1 → P1 → K1</w:t>
       </w:r>
     </w:p>
     <w:p>
@@ -17977,16 +18621,16 @@
       </w:pPr>
       <w:r>
         <w:rPr>
-          <w:bCs/>
-          <w:b/>
-        </w:rPr>
-        <w:t xml:space="preserve">No learning.</w:t>
-      </w:r>
-      <w:r>
-        <w:t xml:space="preserve"> </w:t>
-      </w:r>
-      <w:r>
-        <w:t xml:space="preserve">The system cannot adapt to local mortality data, so new evidence means a manual rule edit.</w:t>
+          <w:iCs/>
+          <w:i/>
+        </w:rPr>
+        <w:t xml:space="preserve">Output:</w:t>
+      </w:r>
+      <w:r>
+        <w:t xml:space="preserve"> </w:t>
+      </w:r>
+      <w:r>
+        <w:t xml:space="preserve">GREEN ALERT (No action - normal day); advice for: CITIZEN, FIRST AID</w:t>
       </w:r>
     </w:p>
     <w:p>
@@ -17999,48 +18643,32 @@
       </w:pPr>
       <w:r>
         <w:rPr>
+          <w:iCs/>
+          <w:i/>
+        </w:rPr>
+        <w:t xml:space="preserve">Result:</w:t>
+      </w:r>
+      <w:r>
+        <w:t xml:space="preserve"> </w:t>
+      </w:r>
+      <w:r>
+        <w:rPr>
           <w:bCs/>
           <w:b/>
         </w:rPr>
-        <w:t xml:space="preserve">No uncertainty handling.</w:t>
-      </w:r>
-      <w:r>
-        <w:t xml:space="preserve"> </w:t>
-      </w:r>
-      <w:r>
-        <w:t xml:space="preserve">A forecast of 45 °C with 60 % confidence is treated the same as an observed 45 °C.</w:t>
-      </w:r>
-    </w:p>
-    <w:p>
-      <w:pPr>
-        <w:numPr>
-          <w:ilvl w:val="0"/>
-          <w:numId w:val="1026"/>
-        </w:numPr>
-        <w:pStyle w:val="Compact"/>
+        <w:t xml:space="preserve">PASS</w:t>
+      </w:r>
+    </w:p>
+    <w:p>
+      <w:pPr>
+        <w:pStyle w:val="FirstParagraph"/>
       </w:pPr>
       <w:r>
         <w:rPr>
           <w:bCs/>
           <w:b/>
         </w:rPr>
-        <w:t xml:space="preserve">Scalability.</w:t>
-      </w:r>
-      <w:r>
-        <w:t xml:space="preserve"> </w:t>
-      </w:r>
-      <w:r>
-        <w:t xml:space="preserve">Validating 59 rules was manageable, but with hundreds of rules, conflicts and redundancy become hard to spot without tools.</w:t>
-      </w:r>
-    </w:p>
-    <w:bookmarkEnd w:id="47"/>
-    <w:bookmarkStart w:id="48" w:name="references"/>
-    <w:p>
-      <w:pPr>
-        <w:pStyle w:val="Heading1"/>
-      </w:pPr>
-      <w:r>
-        <w:t xml:space="preserve">References</w:t>
+        <w:t xml:space="preserve">TC18: Farmer on a normal day - routine advice only</w:t>
       </w:r>
     </w:p>
     <w:p>
@@ -18052,23 +18680,20 @@
         <w:pStyle w:val="Compact"/>
       </w:pPr>
       <w:r>
-        <w:t xml:space="preserve">India Meteorological Department (IMD).</w:t>
-      </w:r>
-      <w:r>
-        <w:t xml:space="preserve"> </w:t>
-      </w:r>
-      <w:r>
         <w:rPr>
           <w:iCs/>
           <w:i/>
         </w:rPr>
-        <w:t xml:space="preserve">FAQ on Heat Wave</w:t>
-      </w:r>
-      <w:r>
-        <w:t xml:space="preserve"> </w:t>
-      </w:r>
-      <w:r>
-        <w:t xml:space="preserve">and heat-wave criteria; colour-coded impact-based warnings. https://mausam.imd.gov.in</w:t>
+        <w:t xml:space="preserve">Inputs:</w:t>
+      </w:r>
+      <w:r>
+        <w:t xml:space="preserve"> </w:t>
+      </w:r>
+      <w:r>
+        <w:rPr>
+          <w:rStyle w:val="VerbatimChar"/>
+        </w:rPr>
+        <w:t xml:space="preserve">role=farmer, region=plains, tmax=36.0, tmax_normal=35.0, heat_days=1, rh=35, farm=crops</w:t>
       </w:r>
     </w:p>
     <w:p>
@@ -18080,7 +18705,17 @@
         <w:pStyle w:val="Compact"/>
       </w:pPr>
       <w:r>
-        <w:t xml:space="preserve">IMD. Warm night criteria, Climate Services, IMD Pune. https://imdpune.gov.in</w:t>
+        <w:rPr>
+          <w:iCs/>
+          <w:i/>
+        </w:rPr>
+        <w:t xml:space="preserve">Expected:</w:t>
+      </w:r>
+      <w:r>
+        <w:t xml:space="preserve"> </w:t>
+      </w:r>
+      <w:r>
+        <w:t xml:space="preserve">alert = GREEN, hw_category = none</w:t>
       </w:r>
     </w:p>
     <w:p>
@@ -18092,20 +18727,17 @@
         <w:pStyle w:val="Compact"/>
       </w:pPr>
       <w:r>
-        <w:t xml:space="preserve">National Disaster Management Authority (NDMA).</w:t>
-      </w:r>
-      <w:r>
-        <w:t xml:space="preserve"> </w:t>
-      </w:r>
-      <w:r>
         <w:rPr>
           <w:iCs/>
           <w:i/>
         </w:rPr>
-        <w:t xml:space="preserve">Guidelines for Preparation of Action Plan - Prevention and Management of Heat Wave</w:t>
-      </w:r>
-      <w:r>
-        <w:t xml:space="preserve">, 2016 (revised 2019). https://ndma.gov.in</w:t>
+        <w:t xml:space="preserve">Rules fired (in order):</w:t>
+      </w:r>
+      <w:r>
+        <w:t xml:space="preserve"> </w:t>
+      </w:r>
+      <w:r>
+        <w:t xml:space="preserve">D1 → D3 → H2 → C8 → A1 → F1 → K1</w:t>
       </w:r>
     </w:p>
     <w:p>
@@ -18117,20 +18749,17 @@
         <w:pStyle w:val="Compact"/>
       </w:pPr>
       <w:r>
-        <w:t xml:space="preserve">Ministry of Health &amp; Family Welfare, NCDC.</w:t>
-      </w:r>
-      <w:r>
-        <w:t xml:space="preserve"> </w:t>
-      </w:r>
-      <w:r>
         <w:rPr>
           <w:iCs/>
           <w:i/>
         </w:rPr>
-        <w:t xml:space="preserve">National Action Plan on Heat Related Illnesses</w:t>
-      </w:r>
-      <w:r>
-        <w:t xml:space="preserve">, National Programme on Climate Change and Human Health (NPCCHH), 2021.</w:t>
+        <w:t xml:space="preserve">Output:</w:t>
+      </w:r>
+      <w:r>
+        <w:t xml:space="preserve"> </w:t>
+      </w:r>
+      <w:r>
+        <w:t xml:space="preserve">GREEN ALERT (No action - normal day); advice for: FARMER</w:t>
       </w:r>
     </w:p>
     <w:p>
@@ -18142,138 +18771,1467 @@
         <w:pStyle w:val="Compact"/>
       </w:pPr>
       <w:r>
-        <w:t xml:space="preserve">Rothfusz, L. P. (1990).</w:t>
-      </w:r>
-      <w:r>
-        <w:t xml:space="preserve"> </w:t>
-      </w:r>
-      <w:r>
         <w:rPr>
           <w:iCs/>
           <w:i/>
         </w:rPr>
-        <w:t xml:space="preserve">The Heat Index Equation</w:t>
-      </w:r>
-      <w:r>
-        <w:t xml:space="preserve">. NWS Southern Region Technical Attachment SR 90-23; NOAA WPC heat-index equation page.</w:t>
+        <w:t xml:space="preserve">Result:</w:t>
+      </w:r>
+      <w:r>
+        <w:t xml:space="preserve"> </w:t>
+      </w:r>
+      <w:r>
+        <w:rPr>
+          <w:bCs/>
+          <w:b/>
+        </w:rPr>
+        <w:t xml:space="preserve">PASS</w:t>
+      </w:r>
+    </w:p>
+    <w:p>
+      <w:pPr>
+        <w:pStyle w:val="FirstParagraph"/>
+      </w:pPr>
+      <w:r>
+        <w:rPr>
+          <w:bCs/>
+          <w:b/>
+        </w:rPr>
+        <w:t xml:space="preserve">TC19: Health department on a normal day</w:t>
       </w:r>
     </w:p>
     <w:p>
       <w:pPr>
         <w:numPr>
           <w:ilvl w:val="0"/>
-          <w:numId w:val="1027"/>
+          <w:numId w:val="1028"/>
         </w:numPr>
         <w:pStyle w:val="Compact"/>
       </w:pPr>
       <w:r>
-        <w:t xml:space="preserve">IMD / ICAR. Gramin Krishi Mausam Sewa - district agromet advisories for heat wave (crop and livestock management).</w:t>
+        <w:rPr>
+          <w:iCs/>
+          <w:i/>
+        </w:rPr>
+        <w:t xml:space="preserve">Inputs:</w:t>
+      </w:r>
+      <w:r>
+        <w:t xml:space="preserve"> </w:t>
+      </w:r>
+      <w:r>
+        <w:rPr>
+          <w:rStyle w:val="VerbatimChar"/>
+        </w:rPr>
+        <w:t xml:space="preserve">role=health, region=coastal, tmax=33.0, tmax_normal=32.0, heat_days=1, rh=40</w:t>
       </w:r>
     </w:p>
     <w:p>
       <w:pPr>
         <w:numPr>
           <w:ilvl w:val="0"/>
-          <w:numId w:val="1027"/>
+          <w:numId w:val="1028"/>
         </w:numPr>
         <w:pStyle w:val="Compact"/>
       </w:pPr>
       <w:r>
-        <w:t xml:space="preserve">Knowlton, K. et al. (2014). Development and implementation of South Asia’s first heat-health action plan in Ahmedabad (India).</w:t>
-      </w:r>
-      <w:r>
-        <w:t xml:space="preserve"> </w:t>
-      </w:r>
-      <w:r>
         <w:rPr>
           <w:iCs/>
           <w:i/>
         </w:rPr>
-        <w:t xml:space="preserve">Int. J. Environ. Res. Public Health</w:t>
-      </w:r>
-      <w:r>
-        <w:t xml:space="preserve">, 11(4), 3473-3492.</w:t>
+        <w:t xml:space="preserve">Expected:</w:t>
+      </w:r>
+      <w:r>
+        <w:t xml:space="preserve"> </w:t>
+      </w:r>
+      <w:r>
+        <w:t xml:space="preserve">alert = GREEN</w:t>
       </w:r>
     </w:p>
     <w:p>
       <w:pPr>
         <w:numPr>
           <w:ilvl w:val="0"/>
-          <w:numId w:val="1027"/>
+          <w:numId w:val="1028"/>
         </w:numPr>
         <w:pStyle w:val="Compact"/>
       </w:pPr>
       <w:r>
-        <w:t xml:space="preserve">Somaiya Vidyavihar University. AI Use Case KJS-CES-01:</w:t>
-      </w:r>
-      <w:r>
-        <w:t xml:space="preserve"> </w:t>
-      </w:r>
-      <w:r>
         <w:rPr>
           <w:iCs/>
           <w:i/>
         </w:rPr>
-        <w:t xml:space="preserve">Climate Intelligence for Heatwave Monitoring, Prediction, and Early Warning</w:t>
-      </w:r>
-      <w:r>
-        <w:t xml:space="preserve"> </w:t>
-      </w:r>
-      <w:r>
-        <w:t xml:space="preserve">(Dr. Radhika Kotecha).</w:t>
+        <w:t xml:space="preserve">Rules fired (in order):</w:t>
+      </w:r>
+      <w:r>
+        <w:t xml:space="preserve"> </w:t>
+      </w:r>
+      <w:r>
+        <w:t xml:space="preserve">D1 → D3 → H2 → C8 → A1 → M3 → K1</w:t>
       </w:r>
     </w:p>
     <w:p>
       <w:pPr>
         <w:numPr>
           <w:ilvl w:val="0"/>
-          <w:numId w:val="1027"/>
+          <w:numId w:val="1028"/>
         </w:numPr>
         <w:pStyle w:val="Compact"/>
       </w:pPr>
       <w:r>
-        <w:t xml:space="preserve">Giarratano, J. &amp; Riley, G.</w:t>
-      </w:r>
-      <w:r>
-        <w:t xml:space="preserve"> </w:t>
-      </w:r>
-      <w:r>
         <w:rPr>
           <w:iCs/>
           <w:i/>
         </w:rPr>
-        <w:t xml:space="preserve">Expert Systems: Principles and Programming</w:t>
-      </w:r>
-      <w:r>
-        <w:t xml:space="preserve">, 4th ed., Thomson (forward chaining, Rete, conflict resolution, CLIPS).</w:t>
+        <w:t xml:space="preserve">Output:</w:t>
+      </w:r>
+      <w:r>
+        <w:t xml:space="preserve"> </w:t>
+      </w:r>
+      <w:r>
+        <w:t xml:space="preserve">GREEN ALERT (No action - normal day); advice for: HEALTH</w:t>
       </w:r>
     </w:p>
     <w:p>
       <w:pPr>
         <w:numPr>
           <w:ilvl w:val="0"/>
-          <w:numId w:val="1027"/>
+          <w:numId w:val="1028"/>
         </w:numPr>
         <w:pStyle w:val="Compact"/>
       </w:pPr>
       <w:r>
-        <w:t xml:space="preserve">Russell, S. &amp; Norvig, P.</w:t>
-      </w:r>
-      <w:r>
-        <w:t xml:space="preserve"> </w:t>
-      </w:r>
-      <w:r>
         <w:rPr>
           <w:iCs/>
           <w:i/>
         </w:rPr>
+        <w:t xml:space="preserve">Result:</w:t>
+      </w:r>
+      <w:r>
+        <w:t xml:space="preserve"> </w:t>
+      </w:r>
+      <w:r>
+        <w:rPr>
+          <w:bCs/>
+          <w:b/>
+        </w:rPr>
+        <w:t xml:space="preserve">PASS</w:t>
+      </w:r>
+    </w:p>
+    <w:p>
+      <w:pPr>
+        <w:pStyle w:val="FirstParagraph"/>
+      </w:pPr>
+      <w:r>
+        <w:rPr>
+          <w:bCs/>
+          <w:b/>
+        </w:rPr>
+        <w:t xml:space="preserve">TC20: Invalid humidity (140 %) - graceful halt</w:t>
+      </w:r>
+    </w:p>
+    <w:p>
+      <w:pPr>
+        <w:numPr>
+          <w:ilvl w:val="0"/>
+          <w:numId w:val="1029"/>
+        </w:numPr>
+        <w:pStyle w:val="Compact"/>
+      </w:pPr>
+      <w:r>
+        <w:rPr>
+          <w:iCs/>
+          <w:i/>
+        </w:rPr>
+        <w:t xml:space="preserve">Inputs:</w:t>
+      </w:r>
+      <w:r>
+        <w:t xml:space="preserve"> </w:t>
+      </w:r>
+      <w:r>
+        <w:rPr>
+          <w:rStyle w:val="VerbatimChar"/>
+        </w:rPr>
+        <w:t xml:space="preserve">role=citizen, region=coastal, tmax=36.0, rh=140</w:t>
+      </w:r>
+    </w:p>
+    <w:p>
+      <w:pPr>
+        <w:numPr>
+          <w:ilvl w:val="0"/>
+          <w:numId w:val="1029"/>
+        </w:numPr>
+        <w:pStyle w:val="Compact"/>
+      </w:pPr>
+      <w:r>
+        <w:rPr>
+          <w:iCs/>
+          <w:i/>
+        </w:rPr>
+        <w:t xml:space="preserve">Expected:</w:t>
+      </w:r>
+      <w:r>
+        <w:t xml:space="preserve"> </w:t>
+      </w:r>
+      <w:r>
+        <w:t xml:space="preserve">error = Relative humidity must be 0..100 %</w:t>
+      </w:r>
+    </w:p>
+    <w:p>
+      <w:pPr>
+        <w:numPr>
+          <w:ilvl w:val="0"/>
+          <w:numId w:val="1029"/>
+        </w:numPr>
+        <w:pStyle w:val="Compact"/>
+      </w:pPr>
+      <w:r>
+        <w:rPr>
+          <w:iCs/>
+          <w:i/>
+        </w:rPr>
+        <w:t xml:space="preserve">Rules fired (in order):</w:t>
+      </w:r>
+      <w:r>
+        <w:t xml:space="preserve"> </w:t>
+      </w:r>
+      <w:r>
+        <w:t xml:space="preserve">V3</w:t>
+      </w:r>
+    </w:p>
+    <w:p>
+      <w:pPr>
+        <w:numPr>
+          <w:ilvl w:val="0"/>
+          <w:numId w:val="1029"/>
+        </w:numPr>
+        <w:pStyle w:val="Compact"/>
+      </w:pPr>
+      <w:r>
+        <w:rPr>
+          <w:iCs/>
+          <w:i/>
+        </w:rPr>
+        <w:t xml:space="preserve">Output:</w:t>
+      </w:r>
+      <w:r>
+        <w:t xml:space="preserve"> </w:t>
+      </w:r>
+      <w:r>
+        <w:t xml:space="preserve">INPUT ERROR: Relative humidity must be 0..100 %</w:t>
+      </w:r>
+    </w:p>
+    <w:p>
+      <w:pPr>
+        <w:numPr>
+          <w:ilvl w:val="0"/>
+          <w:numId w:val="1029"/>
+        </w:numPr>
+        <w:pStyle w:val="Compact"/>
+      </w:pPr>
+      <w:r>
+        <w:rPr>
+          <w:iCs/>
+          <w:i/>
+        </w:rPr>
+        <w:t xml:space="preserve">Result:</w:t>
+      </w:r>
+      <w:r>
+        <w:t xml:space="preserve"> </w:t>
+      </w:r>
+      <w:r>
+        <w:rPr>
+          <w:bCs/>
+          <w:b/>
+        </w:rPr>
+        <w:t xml:space="preserve">PASS</w:t>
+      </w:r>
+    </w:p>
+    <w:p>
+      <w:pPr>
+        <w:pStyle w:val="FirstParagraph"/>
+      </w:pPr>
+      <w:r>
+        <w:rPr>
+          <w:bCs/>
+          <w:b/>
+        </w:rPr>
+        <w:t xml:space="preserve">TC21: Implausible normal temperature (70 C) - graceful halt</w:t>
+      </w:r>
+    </w:p>
+    <w:p>
+      <w:pPr>
+        <w:numPr>
+          <w:ilvl w:val="0"/>
+          <w:numId w:val="1030"/>
+        </w:numPr>
+        <w:pStyle w:val="Compact"/>
+      </w:pPr>
+      <w:r>
+        <w:rPr>
+          <w:iCs/>
+          <w:i/>
+        </w:rPr>
+        <w:t xml:space="preserve">Inputs:</w:t>
+      </w:r>
+      <w:r>
+        <w:t xml:space="preserve"> </w:t>
+      </w:r>
+      <w:r>
+        <w:rPr>
+          <w:rStyle w:val="VerbatimChar"/>
+        </w:rPr>
+        <w:t xml:space="preserve">role=citizen, region=plains, tmax=44.0, tmax_normal=70.0</w:t>
+      </w:r>
+    </w:p>
+    <w:p>
+      <w:pPr>
+        <w:numPr>
+          <w:ilvl w:val="0"/>
+          <w:numId w:val="1030"/>
+        </w:numPr>
+        <w:pStyle w:val="Compact"/>
+      </w:pPr>
+      <w:r>
+        <w:rPr>
+          <w:iCs/>
+          <w:i/>
+        </w:rPr>
+        <w:t xml:space="preserve">Expected:</w:t>
+      </w:r>
+      <w:r>
+        <w:t xml:space="preserve"> </w:t>
+      </w:r>
+      <w:r>
+        <w:t xml:space="preserve">error = Normal Tmax outside plausible range 5..50 C</w:t>
+      </w:r>
+    </w:p>
+    <w:p>
+      <w:pPr>
+        <w:numPr>
+          <w:ilvl w:val="0"/>
+          <w:numId w:val="1030"/>
+        </w:numPr>
+        <w:pStyle w:val="Compact"/>
+      </w:pPr>
+      <w:r>
+        <w:rPr>
+          <w:iCs/>
+          <w:i/>
+        </w:rPr>
+        <w:t xml:space="preserve">Rules fired (in order):</w:t>
+      </w:r>
+      <w:r>
+        <w:t xml:space="preserve"> </w:t>
+      </w:r>
+      <w:r>
+        <w:t xml:space="preserve">V2</w:t>
+      </w:r>
+    </w:p>
+    <w:p>
+      <w:pPr>
+        <w:numPr>
+          <w:ilvl w:val="0"/>
+          <w:numId w:val="1030"/>
+        </w:numPr>
+        <w:pStyle w:val="Compact"/>
+      </w:pPr>
+      <w:r>
+        <w:rPr>
+          <w:iCs/>
+          <w:i/>
+        </w:rPr>
+        <w:t xml:space="preserve">Output:</w:t>
+      </w:r>
+      <w:r>
+        <w:t xml:space="preserve"> </w:t>
+      </w:r>
+      <w:r>
+        <w:t xml:space="preserve">INPUT ERROR: Normal Tmax outside plausible range 5..50 C</w:t>
+      </w:r>
+    </w:p>
+    <w:p>
+      <w:pPr>
+        <w:numPr>
+          <w:ilvl w:val="0"/>
+          <w:numId w:val="1030"/>
+        </w:numPr>
+        <w:pStyle w:val="Compact"/>
+      </w:pPr>
+      <w:r>
+        <w:rPr>
+          <w:iCs/>
+          <w:i/>
+        </w:rPr>
+        <w:t xml:space="preserve">Result:</w:t>
+      </w:r>
+      <w:r>
+        <w:t xml:space="preserve"> </w:t>
+      </w:r>
+      <w:r>
+        <w:rPr>
+          <w:bCs/>
+          <w:b/>
+        </w:rPr>
+        <w:t xml:space="preserve">PASS</w:t>
+      </w:r>
+    </w:p>
+    <w:p>
+      <w:pPr>
+        <w:pStyle w:val="FirstParagraph"/>
+      </w:pPr>
+      <w:r>
+        <w:rPr>
+          <w:bCs/>
+          <w:b/>
+        </w:rPr>
+        <w:t xml:space="preserve">TC22: Invalid persistence (0 days) - graceful halt</w:t>
+      </w:r>
+    </w:p>
+    <w:p>
+      <w:pPr>
+        <w:numPr>
+          <w:ilvl w:val="0"/>
+          <w:numId w:val="1031"/>
+        </w:numPr>
+        <w:pStyle w:val="Compact"/>
+      </w:pPr>
+      <w:r>
+        <w:rPr>
+          <w:iCs/>
+          <w:i/>
+        </w:rPr>
+        <w:t xml:space="preserve">Inputs:</w:t>
+      </w:r>
+      <w:r>
+        <w:t xml:space="preserve"> </w:t>
+      </w:r>
+      <w:r>
+        <w:rPr>
+          <w:rStyle w:val="VerbatimChar"/>
+        </w:rPr>
+        <w:t xml:space="preserve">role=authority, region=plains, tmax=44.0, heat_days=0</w:t>
+      </w:r>
+    </w:p>
+    <w:p>
+      <w:pPr>
+        <w:numPr>
+          <w:ilvl w:val="0"/>
+          <w:numId w:val="1031"/>
+        </w:numPr>
+        <w:pStyle w:val="Compact"/>
+      </w:pPr>
+      <w:r>
+        <w:rPr>
+          <w:iCs/>
+          <w:i/>
+        </w:rPr>
+        <w:t xml:space="preserve">Expected:</w:t>
+      </w:r>
+      <w:r>
+        <w:t xml:space="preserve"> </w:t>
+      </w:r>
+      <w:r>
+        <w:t xml:space="preserve">error = Consecutive hot days must be between 1 and 60</w:t>
+      </w:r>
+    </w:p>
+    <w:p>
+      <w:pPr>
+        <w:numPr>
+          <w:ilvl w:val="0"/>
+          <w:numId w:val="1031"/>
+        </w:numPr>
+        <w:pStyle w:val="Compact"/>
+      </w:pPr>
+      <w:r>
+        <w:rPr>
+          <w:iCs/>
+          <w:i/>
+        </w:rPr>
+        <w:t xml:space="preserve">Rules fired (in order):</w:t>
+      </w:r>
+      <w:r>
+        <w:t xml:space="preserve"> </w:t>
+      </w:r>
+      <w:r>
+        <w:t xml:space="preserve">V4</w:t>
+      </w:r>
+    </w:p>
+    <w:p>
+      <w:pPr>
+        <w:numPr>
+          <w:ilvl w:val="0"/>
+          <w:numId w:val="1031"/>
+        </w:numPr>
+        <w:pStyle w:val="Compact"/>
+      </w:pPr>
+      <w:r>
+        <w:rPr>
+          <w:iCs/>
+          <w:i/>
+        </w:rPr>
+        <w:t xml:space="preserve">Output:</w:t>
+      </w:r>
+      <w:r>
+        <w:t xml:space="preserve"> </w:t>
+      </w:r>
+      <w:r>
+        <w:t xml:space="preserve">INPUT ERROR: Consecutive hot days must be between 1 and 60</w:t>
+      </w:r>
+    </w:p>
+    <w:p>
+      <w:pPr>
+        <w:numPr>
+          <w:ilvl w:val="0"/>
+          <w:numId w:val="1031"/>
+        </w:numPr>
+        <w:pStyle w:val="Compact"/>
+      </w:pPr>
+      <w:r>
+        <w:rPr>
+          <w:iCs/>
+          <w:i/>
+        </w:rPr>
+        <w:t xml:space="preserve">Result:</w:t>
+      </w:r>
+      <w:r>
+        <w:t xml:space="preserve"> </w:t>
+      </w:r>
+      <w:r>
+        <w:rPr>
+          <w:bCs/>
+          <w:b/>
+        </w:rPr>
+        <w:t xml:space="preserve">PASS</w:t>
+      </w:r>
+    </w:p>
+    <w:p>
+      <w:pPr>
+        <w:pStyle w:val="FirstParagraph"/>
+      </w:pPr>
+      <w:r>
+        <w:rPr>
+          <w:bCs/>
+          <w:b/>
+        </w:rPr>
+        <w:t xml:space="preserve">TC23: Heat wave persisting 5 days - Orange for authority</w:t>
+      </w:r>
+    </w:p>
+    <w:p>
+      <w:pPr>
+        <w:numPr>
+          <w:ilvl w:val="0"/>
+          <w:numId w:val="1032"/>
+        </w:numPr>
+        <w:pStyle w:val="Compact"/>
+      </w:pPr>
+      <w:r>
+        <w:rPr>
+          <w:iCs/>
+          <w:i/>
+        </w:rPr>
+        <w:t xml:space="preserve">Inputs:</w:t>
+      </w:r>
+      <w:r>
+        <w:t xml:space="preserve"> </w:t>
+      </w:r>
+      <w:r>
+        <w:rPr>
+          <w:rStyle w:val="VerbatimChar"/>
+        </w:rPr>
+        <w:t xml:space="preserve">role=authority, region=plains, tmax=45.5, tmax_normal=41.5, heat_days=5, rh=15</w:t>
+      </w:r>
+    </w:p>
+    <w:p>
+      <w:pPr>
+        <w:numPr>
+          <w:ilvl w:val="0"/>
+          <w:numId w:val="1032"/>
+        </w:numPr>
+        <w:pStyle w:val="Compact"/>
+      </w:pPr>
+      <w:r>
+        <w:rPr>
+          <w:iCs/>
+          <w:i/>
+        </w:rPr>
+        <w:t xml:space="preserve">Expected:</w:t>
+      </w:r>
+      <w:r>
+        <w:t xml:space="preserve"> </w:t>
+      </w:r>
+      <w:r>
+        <w:t xml:space="preserve">alert = ORANGE, hw_category = heatwave</w:t>
+      </w:r>
+    </w:p>
+    <w:p>
+      <w:pPr>
+        <w:numPr>
+          <w:ilvl w:val="0"/>
+          <w:numId w:val="1032"/>
+        </w:numPr>
+        <w:pStyle w:val="Compact"/>
+      </w:pPr>
+      <w:r>
+        <w:rPr>
+          <w:iCs/>
+          <w:i/>
+        </w:rPr>
+        <w:t xml:space="preserve">Rules fired (in order):</w:t>
+      </w:r>
+      <w:r>
+        <w:t xml:space="preserve"> </w:t>
+      </w:r>
+      <w:r>
+        <w:t xml:space="preserve">D1 → D3 → C1 → H3 → C6 → A4 → G3 → X2 → K1</w:t>
+      </w:r>
+    </w:p>
+    <w:p>
+      <w:pPr>
+        <w:numPr>
+          <w:ilvl w:val="0"/>
+          <w:numId w:val="1032"/>
+        </w:numPr>
+        <w:pStyle w:val="Compact"/>
+      </w:pPr>
+      <w:r>
+        <w:rPr>
+          <w:iCs/>
+          <w:i/>
+        </w:rPr>
+        <w:t xml:space="preserve">Output:</w:t>
+      </w:r>
+      <w:r>
+        <w:t xml:space="preserve"> </w:t>
+      </w:r>
+      <w:r>
+        <w:t xml:space="preserve">ORANGE ALERT (Severe heat alert - be prepared) - IMD category: heatwave; advice for: AUTHORITY, NOTE</w:t>
+      </w:r>
+    </w:p>
+    <w:p>
+      <w:pPr>
+        <w:numPr>
+          <w:ilvl w:val="0"/>
+          <w:numId w:val="1032"/>
+        </w:numPr>
+        <w:pStyle w:val="Compact"/>
+      </w:pPr>
+      <w:r>
+        <w:rPr>
+          <w:iCs/>
+          <w:i/>
+        </w:rPr>
+        <w:t xml:space="preserve">Result:</w:t>
+      </w:r>
+      <w:r>
+        <w:t xml:space="preserve"> </w:t>
+      </w:r>
+      <w:r>
+        <w:rPr>
+          <w:bCs/>
+          <w:b/>
+        </w:rPr>
+        <w:t xml:space="preserve">PASS</w:t>
+      </w:r>
+    </w:p>
+    <w:bookmarkEnd w:id="44"/>
+    <w:bookmarkStart w:id="45" w:name="cross-check-with-the-prolog-edition"/>
+    <w:p>
+      <w:pPr>
+        <w:pStyle w:val="Heading2"/>
+      </w:pPr>
+      <w:r>
+        <w:t xml:space="preserve">4.3 Cross-check with the Prolog edition</w:t>
+      </w:r>
+    </w:p>
+    <w:p>
+      <w:pPr>
+        <w:pStyle w:val="FirstParagraph"/>
+      </w:pPr>
+      <w:r>
+        <w:t xml:space="preserve">Scenarios TC01, TC02, TC03, TC04, TC06 and TC09 were also run through the backward-chaining Prolog edition (</w:t>
+      </w:r>
+      <w:r>
+        <w:rPr>
+          <w:rStyle w:val="VerbatimChar"/>
+        </w:rPr>
+        <w:t xml:space="preserve">?- run_tests_cases.</w:t>
+      </w:r>
+      <w:r>
+        <w:t xml:space="preserve">). It produced</w:t>
+      </w:r>
+      <w:r>
+        <w:t xml:space="preserve"> </w:t>
+      </w:r>
+      <w:r>
+        <w:rPr>
+          <w:bCs/>
+          <w:b/>
+        </w:rPr>
+        <w:t xml:space="preserve">the same alert levels</w:t>
+      </w:r>
+      <w:r>
+        <w:t xml:space="preserve"> </w:t>
+      </w:r>
+      <w:r>
+        <w:t xml:space="preserve">(Green, Yellow, Red, Yellow-watch, Yellow + emergency, Orange), which shows that the knowledge is independent of the inference strategy.</w:t>
+      </w:r>
+    </w:p>
+    <w:bookmarkEnd w:id="45"/>
+    <w:bookmarkEnd w:id="46"/>
+    <w:bookmarkStart w:id="47" w:name="d5.-demo-plan-live-run-2-3-queries"/>
+    <w:p>
+      <w:pPr>
+        <w:pStyle w:val="Heading1"/>
+      </w:pPr>
+      <w:r>
+        <w:t xml:space="preserve">D5. Demo Plan (live run, 2-3 queries)</w:t>
+      </w:r>
+    </w:p>
+    <w:p>
+      <w:pPr>
+        <w:numPr>
+          <w:ilvl w:val="0"/>
+          <w:numId w:val="1033"/>
+        </w:numPr>
+        <w:pStyle w:val="Compact"/>
+      </w:pPr>
+      <w:r>
+        <w:rPr>
+          <w:bCs/>
+          <w:b/>
+        </w:rPr>
+        <w:t xml:space="preserve">Normal vs. watch vs. declared</w:t>
+      </w:r>
+      <w:r>
+        <w:t xml:space="preserve">: TC01 (Green) → TC04 (Yellow</w:t>
+      </w:r>
+      <w:r>
+        <w:t xml:space="preserve"> </w:t>
+      </w:r>
+      <w:r>
+        <w:rPr>
+          <w:iCs/>
+          <w:i/>
+        </w:rPr>
+        <w:t xml:space="preserve">watch</w:t>
+      </w:r>
+      <w:r>
+        <w:t xml:space="preserve">, day 1) → change days to 3 (Yellow</w:t>
+      </w:r>
+      <w:r>
+        <w:t xml:space="preserve"> </w:t>
+      </w:r>
+      <w:r>
+        <w:rPr>
+          <w:iCs/>
+          <w:i/>
+        </w:rPr>
+        <w:t xml:space="preserve">declared</w:t>
+      </w:r>
+      <w:r>
+        <w:t xml:space="preserve">). Shows the IMD persistence rule.</w:t>
+      </w:r>
+    </w:p>
+    <w:p>
+      <w:pPr>
+        <w:numPr>
+          <w:ilvl w:val="0"/>
+          <w:numId w:val="1033"/>
+        </w:numPr>
+        <w:pStyle w:val="Compact"/>
+      </w:pPr>
+      <w:r>
+        <w:rPr>
+          <w:bCs/>
+          <w:b/>
+        </w:rPr>
+        <w:t xml:space="preserve">Escalation and HOW</w:t>
+      </w:r>
+      <w:r>
+        <w:t xml:space="preserve">: TC09. Show the trace, then type</w:t>
+      </w:r>
+      <w:r>
+        <w:t xml:space="preserve"> </w:t>
+      </w:r>
+      <w:r>
+        <w:rPr>
+          <w:rStyle w:val="VerbatimChar"/>
+        </w:rPr>
+        <w:t xml:space="preserve">how alert</w:t>
+      </w:r>
+      <w:r>
+        <w:t xml:space="preserve"> </w:t>
+      </w:r>
+      <w:r>
+        <w:t xml:space="preserve">to see Yellow (A3) → Orange (E1, warm night).</w:t>
+      </w:r>
+    </w:p>
+    <w:p>
+      <w:pPr>
+        <w:numPr>
+          <w:ilvl w:val="0"/>
+          <w:numId w:val="1033"/>
+        </w:numPr>
+        <w:pStyle w:val="Compact"/>
+      </w:pPr>
+      <w:r>
+        <w:rPr>
+          <w:bCs/>
+          <w:b/>
+        </w:rPr>
+        <w:t xml:space="preserve">Robustness and life safety</w:t>
+      </w:r>
+      <w:r>
+        <w:t xml:space="preserve">: enter Tmax = 62 (V1 halts with a clear message), then TC06 (heat-stroke symptoms → EMERGENCY advice fires first).</w:t>
+      </w:r>
+    </w:p>
+    <w:p>
+      <w:pPr>
+        <w:numPr>
+          <w:ilvl w:val="0"/>
+          <w:numId w:val="1033"/>
+        </w:numPr>
+        <w:pStyle w:val="Compact"/>
+      </w:pPr>
+      <w:r>
+        <w:rPr>
+          <w:iCs/>
+          <w:i/>
+        </w:rPr>
+        <w:t xml:space="preserve">(Optional)</w:t>
+      </w:r>
+      <w:r>
+        <w:t xml:space="preserve"> </w:t>
+      </w:r>
+      <w:r>
+        <w:t xml:space="preserve">The same consultation in Prolog: type</w:t>
+      </w:r>
+      <w:r>
+        <w:t xml:space="preserve"> </w:t>
+      </w:r>
+      <w:r>
+        <w:rPr>
+          <w:rStyle w:val="VerbatimChar"/>
+        </w:rPr>
+        <w:t xml:space="preserve">why</w:t>
+      </w:r>
+      <w:r>
+        <w:t xml:space="preserve"> </w:t>
+      </w:r>
+      <w:r>
+        <w:t xml:space="preserve">at the</w:t>
+      </w:r>
+      <w:r>
+        <w:t xml:space="preserve"> </w:t>
+      </w:r>
+      <w:r>
+        <w:t xml:space="preserve">“</w:t>
+      </w:r>
+      <w:r>
+        <w:t xml:space="preserve">normal temperature</w:t>
+      </w:r>
+      <w:r>
+        <w:t xml:space="preserve">”</w:t>
+      </w:r>
+      <w:r>
+        <w:t xml:space="preserve"> </w:t>
+      </w:r>
+      <w:r>
+        <w:t xml:space="preserve">question to show the goal stack.</w:t>
+      </w:r>
+    </w:p>
+    <w:bookmarkEnd w:id="47"/>
+    <w:bookmarkStart w:id="48" w:name="X09b687f8bca004250b8de0292798cb02b0c9c55"/>
+    <w:p>
+      <w:pPr>
+        <w:pStyle w:val="Heading1"/>
+      </w:pPr>
+      <w:r>
+        <w:t xml:space="preserve">D6. Reflection Notes (individual, ½ page each)</w:t>
+      </w:r>
+    </w:p>
+    <w:p>
+      <w:pPr>
+        <w:pStyle w:val="FirstParagraph"/>
+      </w:pPr>
+      <w:r>
+        <w:rPr>
+          <w:iCs/>
+          <w:i/>
+        </w:rPr>
+        <w:t xml:space="preserve">Each member writes this section separately in their own words. The prompts below are a guide.</w:t>
+      </w:r>
+    </w:p>
+    <w:p>
+      <w:pPr>
+        <w:pStyle w:val="BodyText"/>
+      </w:pPr>
+      <w:r>
+        <w:rPr>
+          <w:bCs/>
+          <w:b/>
+        </w:rPr>
+        <w:t xml:space="preserve">Member 1, ____________ (Roll No. ______)</w:t>
+      </w:r>
+      <w:r>
+        <w:t xml:space="preserve"> </w:t>
+      </w:r>
+      <w:r>
+        <w:rPr>
+          <w:iCs/>
+          <w:i/>
+        </w:rPr>
+        <w:t xml:space="preserve">Contribution:</w:t>
+      </w:r>
+      <w:r>
+        <w:t xml:space="preserve"> </w:t>
+      </w:r>
+      <w:r>
+        <w:t xml:space="preserve">______________________________________________</w:t>
+      </w:r>
+      <w:r>
+        <w:t xml:space="preserve"> </w:t>
+      </w:r>
+      <w:r>
+        <w:rPr>
+          <w:iCs/>
+          <w:i/>
+        </w:rPr>
+        <w:t xml:space="preserve">One limitation of rule-based systems observed:</w:t>
+      </w:r>
+      <w:r>
+        <w:t xml:space="preserve"> </w:t>
+      </w:r>
+      <w:r>
+        <w:t xml:space="preserve">______________________________________________</w:t>
+      </w:r>
+    </w:p>
+    <w:p>
+      <w:pPr>
+        <w:pStyle w:val="BodyText"/>
+      </w:pPr>
+      <w:r>
+        <w:rPr>
+          <w:bCs/>
+          <w:b/>
+        </w:rPr>
+        <w:t xml:space="preserve">Member 2, ____________ (Roll No. ______)</w:t>
+      </w:r>
+      <w:r>
+        <w:t xml:space="preserve"> </w:t>
+      </w:r>
+      <w:r>
+        <w:rPr>
+          <w:iCs/>
+          <w:i/>
+        </w:rPr>
+        <w:t xml:space="preserve">Contribution:</w:t>
+      </w:r>
+      <w:r>
+        <w:t xml:space="preserve"> </w:t>
+      </w:r>
+      <w:r>
+        <w:t xml:space="preserve">______________________________________________</w:t>
+      </w:r>
+      <w:r>
+        <w:t xml:space="preserve"> </w:t>
+      </w:r>
+      <w:r>
+        <w:rPr>
+          <w:iCs/>
+          <w:i/>
+        </w:rPr>
+        <w:t xml:space="preserve">One limitation of rule-based systems observed:</w:t>
+      </w:r>
+      <w:r>
+        <w:t xml:space="preserve"> </w:t>
+      </w:r>
+      <w:r>
+        <w:t xml:space="preserve">______________________________________________</w:t>
+      </w:r>
+    </w:p>
+    <w:p>
+      <w:pPr>
+        <w:pStyle w:val="BodyText"/>
+      </w:pPr>
+      <w:r>
+        <w:rPr>
+          <w:bCs/>
+          <w:b/>
+        </w:rPr>
+        <w:t xml:space="preserve">Member 3, ____________ (Roll No. ______)</w:t>
+      </w:r>
+      <w:r>
+        <w:t xml:space="preserve"> </w:t>
+      </w:r>
+      <w:r>
+        <w:rPr>
+          <w:iCs/>
+          <w:i/>
+        </w:rPr>
+        <w:t xml:space="preserve">Contribution:</w:t>
+      </w:r>
+      <w:r>
+        <w:t xml:space="preserve"> </w:t>
+      </w:r>
+      <w:r>
+        <w:t xml:space="preserve">______________________________________________</w:t>
+      </w:r>
+      <w:r>
+        <w:t xml:space="preserve"> </w:t>
+      </w:r>
+      <w:r>
+        <w:rPr>
+          <w:iCs/>
+          <w:i/>
+        </w:rPr>
+        <w:t xml:space="preserve">One limitation of rule-based systems observed:</w:t>
+      </w:r>
+      <w:r>
+        <w:t xml:space="preserve"> </w:t>
+      </w:r>
+      <w:r>
+        <w:t xml:space="preserve">______________________________________________</w:t>
+      </w:r>
+    </w:p>
+    <w:p>
+      <w:pPr>
+        <w:pStyle w:val="BodyText"/>
+      </w:pPr>
+      <w:r>
+        <w:t xml:space="preserve">Limitations we observed, for members to choose from and expand:</w:t>
+      </w:r>
+    </w:p>
+    <w:p>
+      <w:pPr>
+        <w:numPr>
+          <w:ilvl w:val="0"/>
+          <w:numId w:val="1034"/>
+        </w:numPr>
+        <w:pStyle w:val="Compact"/>
+      </w:pPr>
+      <w:r>
+        <w:rPr>
+          <w:bCs/>
+          <w:b/>
+        </w:rPr>
+        <w:t xml:space="preserve">Brittle crisp thresholds.</w:t>
+      </w:r>
+      <w:r>
+        <w:t xml:space="preserve"> </w:t>
+      </w:r>
+      <w:r>
+        <w:t xml:space="preserve">39.9 °C gives</w:t>
+      </w:r>
+      <w:r>
+        <w:t xml:space="preserve"> </w:t>
+      </w:r>
+      <w:r>
+        <w:rPr>
+          <w:iCs/>
+          <w:i/>
+        </w:rPr>
+        <w:t xml:space="preserve">Green</w:t>
+      </w:r>
+      <w:r>
+        <w:t xml:space="preserve"> </w:t>
+      </w:r>
+      <w:r>
+        <w:t xml:space="preserve">and 40.0 °C gives</w:t>
+      </w:r>
+      <w:r>
+        <w:t xml:space="preserve"> </w:t>
+      </w:r>
+      <w:r>
+        <w:rPr>
+          <w:iCs/>
+          <w:i/>
+        </w:rPr>
+        <w:t xml:space="preserve">Yellow</w:t>
+      </w:r>
+      <w:r>
+        <w:t xml:space="preserve"> </w:t>
+      </w:r>
+      <w:r>
+        <w:t xml:space="preserve">(TC11 vs. TC12). Real risk is continuous, and fuzzy logic or certainty factors would model it better.</w:t>
+      </w:r>
+    </w:p>
+    <w:p>
+      <w:pPr>
+        <w:numPr>
+          <w:ilvl w:val="0"/>
+          <w:numId w:val="1034"/>
+        </w:numPr>
+        <w:pStyle w:val="Compact"/>
+      </w:pPr>
+      <w:r>
+        <w:rPr>
+          <w:bCs/>
+          <w:b/>
+        </w:rPr>
+        <w:t xml:space="preserve">The knowledge-acquisition bottleneck.</w:t>
+      </w:r>
+      <w:r>
+        <w:t xml:space="preserve"> </w:t>
+      </w:r>
+      <w:r>
+        <w:t xml:space="preserve">IMD defines the colour code in words (</w:t>
+      </w:r>
+      <w:r>
+        <w:t xml:space="preserve">“</w:t>
+      </w:r>
+      <w:r>
+        <w:t xml:space="preserve">persists for more than 2 days</w:t>
+      </w:r>
+      <w:r>
+        <w:t xml:space="preserve">”</w:t>
+      </w:r>
+      <w:r>
+        <w:t xml:space="preserve">), and turning these into rules forced us to make choices. Day-1 severe heat had to become a</w:t>
+      </w:r>
+      <w:r>
+        <w:t xml:space="preserve"> </w:t>
+      </w:r>
+      <w:r>
+        <w:rPr>
+          <w:iCs/>
+          <w:i/>
+        </w:rPr>
+        <w:t xml:space="preserve">watch</w:t>
+      </w:r>
+      <w:r>
+        <w:t xml:space="preserve">, and the case where the duration is unknown needed its own rule (A8).</w:t>
+      </w:r>
+    </w:p>
+    <w:p>
+      <w:pPr>
+        <w:numPr>
+          <w:ilvl w:val="0"/>
+          <w:numId w:val="1034"/>
+        </w:numPr>
+        <w:pStyle w:val="Compact"/>
+      </w:pPr>
+      <w:r>
+        <w:rPr>
+          <w:bCs/>
+          <w:b/>
+        </w:rPr>
+        <w:t xml:space="preserve">Rule interaction is hard to reason about.</w:t>
+      </w:r>
+      <w:r>
+        <w:t xml:space="preserve"> </w:t>
+      </w:r>
+      <w:r>
+        <w:t xml:space="preserve">Our first version escalated hot, dry 44 °C days to Orange, because the Rothfusz heat-index formula exaggerates heat stress in very dry air. Adding the RH ≥ 40 % condition to E3 fixed it, but the bug appeared only through testing.</w:t>
+      </w:r>
+    </w:p>
+    <w:p>
+      <w:pPr>
+        <w:numPr>
+          <w:ilvl w:val="0"/>
+          <w:numId w:val="1034"/>
+        </w:numPr>
+        <w:pStyle w:val="Compact"/>
+      </w:pPr>
+      <w:r>
+        <w:rPr>
+          <w:bCs/>
+          <w:b/>
+        </w:rPr>
+        <w:t xml:space="preserve">No learning.</w:t>
+      </w:r>
+      <w:r>
+        <w:t xml:space="preserve"> </w:t>
+      </w:r>
+      <w:r>
+        <w:t xml:space="preserve">The system cannot adapt to local mortality data, so new evidence means a manual rule edit.</w:t>
+      </w:r>
+    </w:p>
+    <w:p>
+      <w:pPr>
+        <w:numPr>
+          <w:ilvl w:val="0"/>
+          <w:numId w:val="1034"/>
+        </w:numPr>
+        <w:pStyle w:val="Compact"/>
+      </w:pPr>
+      <w:r>
+        <w:rPr>
+          <w:bCs/>
+          <w:b/>
+        </w:rPr>
+        <w:t xml:space="preserve">No uncertainty handling.</w:t>
+      </w:r>
+      <w:r>
+        <w:t xml:space="preserve"> </w:t>
+      </w:r>
+      <w:r>
+        <w:t xml:space="preserve">A forecast of 45 °C with 60 % confidence is treated the same as an observed 45 °C.</w:t>
+      </w:r>
+    </w:p>
+    <w:p>
+      <w:pPr>
+        <w:numPr>
+          <w:ilvl w:val="0"/>
+          <w:numId w:val="1034"/>
+        </w:numPr>
+        <w:pStyle w:val="Compact"/>
+      </w:pPr>
+      <w:r>
+        <w:rPr>
+          <w:bCs/>
+          <w:b/>
+        </w:rPr>
+        <w:t xml:space="preserve">Scalability.</w:t>
+      </w:r>
+      <w:r>
+        <w:t xml:space="preserve"> </w:t>
+      </w:r>
+      <w:r>
+        <w:t xml:space="preserve">Validating 59 rules was manageable, but with hundreds of rules, conflicts and redundancy become hard to spot without tools.</w:t>
+      </w:r>
+    </w:p>
+    <w:bookmarkEnd w:id="48"/>
+    <w:bookmarkStart w:id="49" w:name="references"/>
+    <w:p>
+      <w:pPr>
+        <w:pStyle w:val="Heading1"/>
+      </w:pPr>
+      <w:r>
+        <w:t xml:space="preserve">References</w:t>
+      </w:r>
+    </w:p>
+    <w:p>
+      <w:pPr>
+        <w:numPr>
+          <w:ilvl w:val="0"/>
+          <w:numId w:val="1035"/>
+        </w:numPr>
+        <w:pStyle w:val="Compact"/>
+      </w:pPr>
+      <w:r>
+        <w:t xml:space="preserve">India Meteorological Department (IMD).</w:t>
+      </w:r>
+      <w:r>
+        <w:t xml:space="preserve"> </w:t>
+      </w:r>
+      <w:r>
+        <w:rPr>
+          <w:iCs/>
+          <w:i/>
+        </w:rPr>
+        <w:t xml:space="preserve">FAQ on Heat Wave</w:t>
+      </w:r>
+      <w:r>
+        <w:t xml:space="preserve"> </w:t>
+      </w:r>
+      <w:r>
+        <w:t xml:space="preserve">and heat-wave criteria; colour-coded impact-based warnings. https://mausam.imd.gov.in</w:t>
+      </w:r>
+    </w:p>
+    <w:p>
+      <w:pPr>
+        <w:numPr>
+          <w:ilvl w:val="0"/>
+          <w:numId w:val="1035"/>
+        </w:numPr>
+        <w:pStyle w:val="Compact"/>
+      </w:pPr>
+      <w:r>
+        <w:t xml:space="preserve">IMD. Warm night criteria, Climate Services, IMD Pune. https://imdpune.gov.in</w:t>
+      </w:r>
+    </w:p>
+    <w:p>
+      <w:pPr>
+        <w:numPr>
+          <w:ilvl w:val="0"/>
+          <w:numId w:val="1035"/>
+        </w:numPr>
+        <w:pStyle w:val="Compact"/>
+      </w:pPr>
+      <w:r>
+        <w:t xml:space="preserve">National Disaster Management Authority (NDMA).</w:t>
+      </w:r>
+      <w:r>
+        <w:t xml:space="preserve"> </w:t>
+      </w:r>
+      <w:r>
+        <w:rPr>
+          <w:iCs/>
+          <w:i/>
+        </w:rPr>
+        <w:t xml:space="preserve">Guidelines for Preparation of Action Plan - Prevention and Management of Heat Wave</w:t>
+      </w:r>
+      <w:r>
+        <w:t xml:space="preserve">, 2016 (revised 2019). https://ndma.gov.in</w:t>
+      </w:r>
+    </w:p>
+    <w:p>
+      <w:pPr>
+        <w:numPr>
+          <w:ilvl w:val="0"/>
+          <w:numId w:val="1035"/>
+        </w:numPr>
+        <w:pStyle w:val="Compact"/>
+      </w:pPr>
+      <w:r>
+        <w:t xml:space="preserve">Ministry of Health &amp; Family Welfare, NCDC.</w:t>
+      </w:r>
+      <w:r>
+        <w:t xml:space="preserve"> </w:t>
+      </w:r>
+      <w:r>
+        <w:rPr>
+          <w:iCs/>
+          <w:i/>
+        </w:rPr>
+        <w:t xml:space="preserve">National Action Plan on Heat Related Illnesses</w:t>
+      </w:r>
+      <w:r>
+        <w:t xml:space="preserve">, National Programme on Climate Change and Human Health (NPCCHH), 2021.</w:t>
+      </w:r>
+    </w:p>
+    <w:p>
+      <w:pPr>
+        <w:numPr>
+          <w:ilvl w:val="0"/>
+          <w:numId w:val="1035"/>
+        </w:numPr>
+        <w:pStyle w:val="Compact"/>
+      </w:pPr>
+      <w:r>
+        <w:t xml:space="preserve">Rothfusz, L. P. (1990).</w:t>
+      </w:r>
+      <w:r>
+        <w:t xml:space="preserve"> </w:t>
+      </w:r>
+      <w:r>
+        <w:rPr>
+          <w:iCs/>
+          <w:i/>
+        </w:rPr>
+        <w:t xml:space="preserve">The Heat Index Equation</w:t>
+      </w:r>
+      <w:r>
+        <w:t xml:space="preserve">. NWS Southern Region Technical Attachment SR 90-23; NOAA WPC heat-index equation page.</w:t>
+      </w:r>
+    </w:p>
+    <w:p>
+      <w:pPr>
+        <w:numPr>
+          <w:ilvl w:val="0"/>
+          <w:numId w:val="1035"/>
+        </w:numPr>
+        <w:pStyle w:val="Compact"/>
+      </w:pPr>
+      <w:r>
+        <w:t xml:space="preserve">IMD / ICAR. Gramin Krishi Mausam Sewa - district agromet advisories for heat wave (crop and livestock management).</w:t>
+      </w:r>
+    </w:p>
+    <w:p>
+      <w:pPr>
+        <w:numPr>
+          <w:ilvl w:val="0"/>
+          <w:numId w:val="1035"/>
+        </w:numPr>
+        <w:pStyle w:val="Compact"/>
+      </w:pPr>
+      <w:r>
+        <w:t xml:space="preserve">Knowlton, K. et al. (2014). Development and implementation of South Asia’s first heat-health action plan in Ahmedabad (India).</w:t>
+      </w:r>
+      <w:r>
+        <w:t xml:space="preserve"> </w:t>
+      </w:r>
+      <w:r>
+        <w:rPr>
+          <w:iCs/>
+          <w:i/>
+        </w:rPr>
+        <w:t xml:space="preserve">Int. J. Environ. Res. Public Health</w:t>
+      </w:r>
+      <w:r>
+        <w:t xml:space="preserve">, 11(4), 3473-3492.</w:t>
+      </w:r>
+    </w:p>
+    <w:p>
+      <w:pPr>
+        <w:numPr>
+          <w:ilvl w:val="0"/>
+          <w:numId w:val="1035"/>
+        </w:numPr>
+        <w:pStyle w:val="Compact"/>
+      </w:pPr>
+      <w:r>
+        <w:t xml:space="preserve">Somaiya Vidyavihar University. AI Use Case KJS-CES-01:</w:t>
+      </w:r>
+      <w:r>
+        <w:t xml:space="preserve"> </w:t>
+      </w:r>
+      <w:r>
+        <w:rPr>
+          <w:iCs/>
+          <w:i/>
+        </w:rPr>
+        <w:t xml:space="preserve">Climate Intelligence for Heatwave Monitoring, Prediction, and Early Warning</w:t>
+      </w:r>
+      <w:r>
+        <w:t xml:space="preserve"> </w:t>
+      </w:r>
+      <w:r>
+        <w:t xml:space="preserve">(Dr. Radhika Kotecha).</w:t>
+      </w:r>
+    </w:p>
+    <w:p>
+      <w:pPr>
+        <w:numPr>
+          <w:ilvl w:val="0"/>
+          <w:numId w:val="1035"/>
+        </w:numPr>
+        <w:pStyle w:val="Compact"/>
+      </w:pPr>
+      <w:r>
+        <w:t xml:space="preserve">Giarratano, J. &amp; Riley, G.</w:t>
+      </w:r>
+      <w:r>
+        <w:t xml:space="preserve"> </w:t>
+      </w:r>
+      <w:r>
+        <w:rPr>
+          <w:iCs/>
+          <w:i/>
+        </w:rPr>
+        <w:t xml:space="preserve">Expert Systems: Principles and Programming</w:t>
+      </w:r>
+      <w:r>
+        <w:t xml:space="preserve">, 4th ed., Thomson (forward chaining, Rete, conflict resolution, CLIPS).</w:t>
+      </w:r>
+    </w:p>
+    <w:p>
+      <w:pPr>
+        <w:numPr>
+          <w:ilvl w:val="0"/>
+          <w:numId w:val="1035"/>
+        </w:numPr>
+        <w:pStyle w:val="Compact"/>
+      </w:pPr>
+      <w:r>
+        <w:t xml:space="preserve">Russell, S. &amp; Norvig, P.</w:t>
+      </w:r>
+      <w:r>
+        <w:t xml:space="preserve"> </w:t>
+      </w:r>
+      <w:r>
+        <w:rPr>
+          <w:iCs/>
+          <w:i/>
+        </w:rPr>
         <w:t xml:space="preserve">Artificial Intelligence: A Modern Approach</w:t>
       </w:r>
       <w:r>
         <w:t xml:space="preserve">, 4th ed. - Ch. 9, inference in first-order logic (forward/backward chaining).</w:t>
       </w:r>
     </w:p>
-    <w:bookmarkEnd w:id="48"/>
+    <w:bookmarkEnd w:id="49"/>
     <w:sectPr>
       <w:headerReference r:id="rId9" w:type="default"/>
       <w:footerReference r:id="rId10" w:type="default"/>
@@ -18711,6 +20669,30 @@
     <w:abstractNumId w:val="991"/>
   </w:num>
   <w:num w:numId="1025">
+    <w:abstractNumId w:val="991"/>
+  </w:num>
+  <w:num w:numId="1026">
+    <w:abstractNumId w:val="991"/>
+  </w:num>
+  <w:num w:numId="1027">
+    <w:abstractNumId w:val="991"/>
+  </w:num>
+  <w:num w:numId="1028">
+    <w:abstractNumId w:val="991"/>
+  </w:num>
+  <w:num w:numId="1029">
+    <w:abstractNumId w:val="991"/>
+  </w:num>
+  <w:num w:numId="1030">
+    <w:abstractNumId w:val="991"/>
+  </w:num>
+  <w:num w:numId="1031">
+    <w:abstractNumId w:val="991"/>
+  </w:num>
+  <w:num w:numId="1032">
+    <w:abstractNumId w:val="991"/>
+  </w:num>
+  <w:num w:numId="1033">
     <w:abstractNumId w:val="99411"/>
     <w:lvlOverride w:ilvl="0">
       <w:startOverride w:val="1"/>
@@ -18740,10 +20722,10 @@
       <w:startOverride w:val="1"/>
     </w:lvlOverride>
   </w:num>
-  <w:num w:numId="1026">
+  <w:num w:numId="1034">
     <w:abstractNumId w:val="991"/>
   </w:num>
-  <w:num w:numId="1027">
+  <w:num w:numId="1035">
     <w:abstractNumId w:val="99411"/>
     <w:lvlOverride w:ilvl="0">
       <w:startOverride w:val="1"/>

</xml_diff>

<commit_message>
Regenerate report after clearing stale bytecode; add cache warning to drills
</commit_message>
<xml_diff>
--- a/docs/HeatGuard_Report.docx
+++ b/docs/HeatGuard_Report.docx
@@ -5600,7 +5600,7 @@
               <w:rPr>
                 <w:sz w:val="16"/>
               </w:rPr>
-              <w:t xml:space="preserve">AND tmax &gt;= 35</w:t>
+              <w:t xml:space="preserve">AND tmax &gt;= 37</w:t>
             </w:r>
           </w:p>
         </w:tc>
@@ -14550,7 +14550,7 @@
           <w:bCs/>
           <w:b/>
         </w:rPr>
-        <w:t xml:space="preserve">Result: 1 failed, 34 passed in 0.09s</w:t>
+        <w:t xml:space="preserve">Result: 35 passed in 0.09s</w:t>
       </w:r>
     </w:p>
     <w:bookmarkStart w:id="43" w:name="summary"/>
@@ -14818,22 +14818,22 @@
               <w:rPr>
                 <w:sz w:val="16"/>
               </w:rPr>
-              <w:t xml:space="preserve">10</w:t>
-            </w:r>
-          </w:p>
-        </w:tc>
-        <w:tc>
-          <w:tcPr/>
-          <w:p>
-            <w:pPr>
-              <w:pStyle w:val="Compact"/>
-              <w:jc w:val="left"/>
-            </w:pPr>
-            <w:r>
-              <w:rPr>
-                <w:sz w:val="16"/>
-              </w:rPr>
-              <w:t xml:space="preserve">FAIL</w:t>
+              <w:t xml:space="preserve">9</w:t>
+            </w:r>
+          </w:p>
+        </w:tc>
+        <w:tc>
+          <w:tcPr/>
+          <w:p>
+            <w:pPr>
+              <w:pStyle w:val="Compact"/>
+              <w:jc w:val="left"/>
+            </w:pPr>
+            <w:r>
+              <w:rPr>
+                <w:sz w:val="16"/>
+              </w:rPr>
+              <w:t xml:space="preserve">PASS</w:t>
             </w:r>
           </w:p>
         </w:tc>
@@ -16673,7 +16673,7 @@
         <w:t xml:space="preserve"> </w:t>
       </w:r>
       <w:r>
-        <w:t xml:space="preserve">D1 → D3 → C2 → H3 → C8 → A1 → E2 → P4 → P2 → K1</w:t>
+        <w:t xml:space="preserve">D1 → D3 → H3 → C8 → A1 → E2 → P4 → P2 → K1</w:t>
       </w:r>
     </w:p>
     <w:p>
@@ -16721,7 +16721,7 @@
           <w:bCs/>
           <w:b/>
         </w:rPr>
-        <w:t xml:space="preserve">FAIL</w:t>
+        <w:t xml:space="preserve">PASS</w:t>
       </w:r>
     </w:p>
     <w:p>

</xml_diff>